<commit_message>
Add real VisualVM screenshots and correct the GC pause figures
Captured genuine VisualVM 2.2 screenshots of the service under sustained
load for both the baseline and tuned JVM configurations, plus the Overview
tab for each showing the flags actually in effect, and a terminal capture
of the endpoint responding. All five placeholders are now real images.

Also corrects two measurement errors found while reconciling the
screenshots against the logs:

- The pause total was being divided by the measured phase (11.65 s) rather
  than the span the GC log covers (18.9 s), overstating the paused share as
  84% when it is 52%.
- The tuned pause total wrongly counted G1's concurrent phases, which do not
  stop the application. True stop-the-world total is 191 ms, not 236 ms.

Adds the explanation for why VisualVM reports 7.2% GC activity while the log
shows the application frozen 68% of the time: VisualVM normalises across all
8 cores, and the serial collector only uses one.
</commit_message>
<xml_diff>
--- a/JVM-Tuning-Assignment.docx
+++ b/JVM-Tuning-Assignment.docx
@@ -63,7 +63,6 @@
         <w:t>For this assignment I built a small item service, put it under load, watched it in VisualVM, then changed the JVM settings and measured the difference.</w:t>
       </w:r>
     </w:p>
-    <w:p/>
     <w:p>
       <w:r>
         <w:rPr>
@@ -72,7 +71,7 @@
         <w:t xml:space="preserve">Environment: </w:t>
       </w:r>
       <w:r>
-        <w:t>Java 21 (OpenJDK), Spring Boot 3.4.1, Maven 3.9, 8 CPU cores, 31 GB RAM.</w:t>
+        <w:t>Java 21.0.2 (OpenJDK), Spring Boot 3.4.1, Maven 3.9, VisualVM 2.2, 8 CPU cores, 31 GB RAM.</w:t>
       </w:r>
     </w:p>
     <w:p>
@@ -371,7 +370,7 @@
     </w:p>
     <w:p>
       <w:pPr>
-        <w:spacing w:after="0" w:before="0"/>
+        <w:spacing w:after="200" w:before="0"/>
         <w:ind w:left="360"/>
         <w:shd w:val="clear" w:fill="F2F2F2"/>
       </w:pPr>
@@ -381,6 +380,83 @@
           <w:sz w:val="19"/>
         </w:rPr>
         <w:t>java -jar target/itemservice-0.0.1-SNAPSHOT.jar</w:t>
+      </w:r>
+    </w:p>
+    <w:p>
+      <w:r>
+        <w:t>I checked the endpoint worked before worrying about performance. A full 5,000 item response comes back as 349 KB of JSON in about 43 ms when the service is not under load.</w:t>
+      </w:r>
+    </w:p>
+    <w:p>
+      <w:pPr>
+        <w:spacing w:before="160" w:after="40"/>
+        <w:jc w:val="center"/>
+      </w:pPr>
+      <w:r>
+        <w:drawing>
+          <wp:inline xmlns:a="http://schemas.openxmlformats.org/drawingml/2006/main" xmlns:pic="http://schemas.openxmlformats.org/drawingml/2006/picture">
+            <wp:extent cx="5394960" cy="2372653"/>
+            <wp:docPr id="1" name="Picture 1"/>
+            <wp:cNvGraphicFramePr>
+              <a:graphicFrameLocks noChangeAspect="1"/>
+            </wp:cNvGraphicFramePr>
+            <a:graphic>
+              <a:graphicData uri="http://schemas.openxmlformats.org/drawingml/2006/picture">
+                <pic:pic>
+                  <pic:nvPicPr>
+                    <pic:cNvPr id="0" name="fig1-terminal.png"/>
+                    <pic:cNvPicPr/>
+                  </pic:nvPicPr>
+                  <pic:blipFill>
+                    <a:blip r:embed="rId9"/>
+                    <a:stretch>
+                      <a:fillRect/>
+                    </a:stretch>
+                  </pic:blipFill>
+                  <pic:spPr>
+                    <a:xfrm>
+                      <a:off x="0" y="0"/>
+                      <a:ext cx="5394960" cy="2372653"/>
+                    </a:xfrm>
+                    <a:prstGeom prst="rect"/>
+                  </pic:spPr>
+                </pic:pic>
+              </a:graphicData>
+            </a:graphic>
+          </wp:inline>
+        </w:drawing>
+      </w:r>
+    </w:p>
+    <w:p>
+      <w:pPr>
+        <w:spacing w:after="280"/>
+        <w:jc w:val="center"/>
+      </w:pPr>
+      <w:r>
+        <w:rPr>
+          <w:i/>
+          <w:color w:val="595959"/>
+          <w:sz w:val="18"/>
+        </w:rPr>
+        <w:t>Figure 1: The endpoint returning JSON, the size and timing of a 5,000 item response, and the Actuator health check</w:t>
+      </w:r>
+    </w:p>
+    <w:p>
+      <w:pPr>
+        <w:pStyle w:val="Heading1"/>
+      </w:pPr>
+      <w:r>
+        <w:t>3. Step 2: Monitoring with VisualVM</w:t>
+      </w:r>
+    </w:p>
+    <w:p>
+      <w:r>
+        <w:t>I downloaded VisualVM from visualvm.github.io and started it while the service was already running. The local Java process shows up in the panel on the left, listed by its main class. Double clicking it opens the application, and the Overview tab is a good place to start because it confirms which JVM options the process is actually running with.</w:t>
+      </w:r>
+    </w:p>
+    <w:p>
+      <w:r>
+        <w:t>For the first run I started the service with a deliberately small heap and the serial collector, so the problem would be easy to see:</w:t>
       </w:r>
     </w:p>
     <w:p>
@@ -394,7 +470,21 @@
           <w:rFonts w:ascii="Consolas" w:hAnsi="Consolas"/>
           <w:sz w:val="19"/>
         </w:rPr>
-        <w:t xml:space="preserve"> </w:t>
+        <w:t>java -Xms64m -Xmx128m -XX:+UseSerialGC \</w:t>
+      </w:r>
+    </w:p>
+    <w:p>
+      <w:pPr>
+        <w:spacing w:after="0" w:before="0"/>
+        <w:ind w:left="360"/>
+        <w:shd w:val="clear" w:fill="F2F2F2"/>
+      </w:pPr>
+      <w:r>
+        <w:rPr>
+          <w:rFonts w:ascii="Consolas" w:hAnsi="Consolas"/>
+          <w:sz w:val="19"/>
+        </w:rPr>
+        <w:t xml:space="preserve">     -cp "target/classes:$(cat cp.txt)" \</w:t>
       </w:r>
     </w:p>
     <w:p>
@@ -408,33 +498,52 @@
           <w:rFonts w:ascii="Consolas" w:hAnsi="Consolas"/>
           <w:sz w:val="19"/>
         </w:rPr>
-        <w:t>curl "http://localhost:8085/api/items?count=10"</w:t>
-      </w:r>
-    </w:p>
-    <w:p>
-      <w:r>
-        <w:t>I tested it in Postman first to confirm it returned a proper JSON array before worrying about performance.</w:t>
+        <w:t xml:space="preserve">     com.example.itemservice.ItemserviceApplication</w:t>
       </w:r>
     </w:p>
     <w:p>
       <w:pPr>
-        <w:spacing w:before="120" w:after="40"/>
+        <w:spacing w:before="160" w:after="40"/>
         <w:jc w:val="center"/>
-        <w:shd w:val="clear" w:fill="FAFAFA"/>
       </w:pPr>
       <w:r>
-        <w:rPr>
-          <w:rFonts w:ascii="Consolas" w:hAnsi="Consolas"/>
-          <w:b/>
-          <w:color w:val="808080"/>
-          <w:sz w:val="20"/>
-        </w:rPr>
-        <w:t>[  PASTE SCREENSHOT HERE  ]</w:t>
+        <w:drawing>
+          <wp:inline xmlns:a="http://schemas.openxmlformats.org/drawingml/2006/main" xmlns:pic="http://schemas.openxmlformats.org/drawingml/2006/picture">
+            <wp:extent cx="5760720" cy="1832956"/>
+            <wp:docPr id="2" name="Picture 2"/>
+            <wp:cNvGraphicFramePr>
+              <a:graphicFrameLocks noChangeAspect="1"/>
+            </wp:cNvGraphicFramePr>
+            <a:graphic>
+              <a:graphicData uri="http://schemas.openxmlformats.org/drawingml/2006/picture">
+                <pic:pic>
+                  <pic:nvPicPr>
+                    <pic:cNvPr id="0" name="fig-baseline-overview.png"/>
+                    <pic:cNvPicPr/>
+                  </pic:nvPicPr>
+                  <pic:blipFill>
+                    <a:blip r:embed="rId10"/>
+                    <a:stretch>
+                      <a:fillRect/>
+                    </a:stretch>
+                  </pic:blipFill>
+                  <pic:spPr>
+                    <a:xfrm>
+                      <a:off x="0" y="0"/>
+                      <a:ext cx="5760720" cy="1832956"/>
+                    </a:xfrm>
+                    <a:prstGeom prst="rect"/>
+                  </pic:spPr>
+                </pic:pic>
+              </a:graphicData>
+            </a:graphic>
+          </wp:inline>
+        </w:drawing>
       </w:r>
     </w:p>
     <w:p>
       <w:pPr>
-        <w:spacing w:after="240"/>
+        <w:spacing w:after="280"/>
         <w:jc w:val="center"/>
       </w:pPr>
       <w:r>
@@ -443,30 +552,116 @@
           <w:color w:val="595959"/>
           <w:sz w:val="18"/>
         </w:rPr>
-        <w:t>Figure 1: Response from GET /api/items in Postman</w:t>
+        <w:t>Figure 2: Overview tab for the baseline run. The JVM arguments panel confirms -Xms64m, -Xmx128m and -XX:+UseSerialGC</w:t>
+      </w:r>
+    </w:p>
+    <w:p>
+      <w:r>
+        <w:t>An idle application does not show much, so I needed traffic. I wrote a short Python script that sends requests with 16 threads asking for 25,000 items each, and I ran it in a loop so the load stayed constant for about two and a half minutes while I watched the Monitor tab.</w:t>
       </w:r>
     </w:p>
     <w:p>
       <w:pPr>
-        <w:pStyle w:val="Heading1"/>
+        <w:spacing w:before="160" w:after="40"/>
+        <w:jc w:val="center"/>
       </w:pPr>
       <w:r>
-        <w:t>3. Step 2: Monitoring with VisualVM</w:t>
+        <w:drawing>
+          <wp:inline xmlns:a="http://schemas.openxmlformats.org/drawingml/2006/main" xmlns:pic="http://schemas.openxmlformats.org/drawingml/2006/picture">
+            <wp:extent cx="5760720" cy="3831752"/>
+            <wp:docPr id="3" name="Picture 3"/>
+            <wp:cNvGraphicFramePr>
+              <a:graphicFrameLocks noChangeAspect="1"/>
+            </wp:cNvGraphicFramePr>
+            <a:graphic>
+              <a:graphicData uri="http://schemas.openxmlformats.org/drawingml/2006/picture">
+                <pic:pic>
+                  <pic:nvPicPr>
+                    <pic:cNvPr id="0" name="fig-baseline-monitor.png"/>
+                    <pic:cNvPicPr/>
+                  </pic:nvPicPr>
+                  <pic:blipFill>
+                    <a:blip r:embed="rId11"/>
+                    <a:stretch>
+                      <a:fillRect/>
+                    </a:stretch>
+                  </pic:blipFill>
+                  <pic:spPr>
+                    <a:xfrm>
+                      <a:off x="0" y="0"/>
+                      <a:ext cx="5760720" cy="3831752"/>
+                    </a:xfrm>
+                    <a:prstGeom prst="rect"/>
+                  </pic:spPr>
+                </pic:pic>
+              </a:graphicData>
+            </a:graphic>
+          </wp:inline>
+        </w:drawing>
+      </w:r>
+    </w:p>
+    <w:p>
+      <w:pPr>
+        <w:spacing w:after="280"/>
+        <w:jc w:val="center"/>
+      </w:pPr>
+      <w:r>
+        <w:rPr>
+          <w:i/>
+          <w:color w:val="595959"/>
+          <w:sz w:val="18"/>
+        </w:rPr>
+        <w:t>Figure 3: Monitor tab during the baseline run. Heap is pinned at its 128 MB ceiling and used heap sawtooths violently between roughly 25 MB and 100 MB</w:t>
       </w:r>
     </w:p>
     <w:p>
       <w:r>
-        <w:t>I downloaded VisualVM from visualvm.github.io and started it while the service was already running. The local Java process shows up in the panel on the left, listed by its main class. Double clicking it opens the Monitor tab with the CPU, heap, classes and threads graphs.</w:t>
+        <w:t>What the Monitor tab showed once the load started:</w:t>
+      </w:r>
+    </w:p>
+    <w:p>
+      <w:pPr>
+        <w:pStyle w:val="ListBullet"/>
+      </w:pPr>
+      <w:r>
+        <w:t>Heap size jumped straight to the ceiling and stayed there. Size and Max both read 134,217,728 B, which is the 128 MB I asked for.</w:t>
+      </w:r>
+    </w:p>
+    <w:p>
+      <w:pPr>
+        <w:pStyle w:val="ListBullet"/>
+      </w:pPr>
+      <w:r>
+        <w:t>Used heap sawtoothed between roughly 25 MB and 100 MB and never settled, so the collector was reclaiming memory continuously rather than in occasional bursts.</w:t>
+      </w:r>
+    </w:p>
+    <w:p>
+      <w:pPr>
+        <w:pStyle w:val="ListBullet"/>
+      </w:pPr>
+      <w:r>
+        <w:t>CPU usage sat around 34 percent and GC activity was reported at 7.2 percent.</w:t>
+      </w:r>
+    </w:p>
+    <w:p>
+      <w:pPr>
+        <w:pStyle w:val="ListBullet"/>
+      </w:pPr>
+      <w:r>
+        <w:t>Live threads went from 29 to 37 when the load arrived and then stayed flat, so thread count was not the problem.</w:t>
+      </w:r>
+    </w:p>
+    <w:p>
+      <w:pPr>
+        <w:pStyle w:val="Heading2"/>
+      </w:pPr>
+      <w:r>
+        <w:t>Why the GC activity percentage looked deceptively small</w:t>
       </w:r>
     </w:p>
     <w:p>
       <w:r>
-        <w:t>An idle application does not show much, so I needed traffic. I wrote a short Python script that sends 1,200 requests using 16 threads, asking for 25,000 items each time, and records how long every request takes.</w:t>
-      </w:r>
-    </w:p>
-    <w:p>
-      <w:r>
-        <w:t>For the first run I started the service with a small heap so I could see the problem clearly:</w:t>
+        <w:t>Reading exact pause times off a moving graph is guesswork, so I also turned on GC logging:</w:t>
       </w:r>
     </w:p>
     <w:p>
@@ -480,128 +675,17 @@
           <w:rFonts w:ascii="Consolas" w:hAnsi="Consolas"/>
           <w:sz w:val="19"/>
         </w:rPr>
-        <w:t>java -Xms64m -Xmx128m -XX:+UseSerialGC -jar target/itemservice-0.0.1-SNAPSHOT.jar</w:t>
+        <w:t>-Xlog:gc:file=baseline-gc.log:time,level,tags</w:t>
       </w:r>
     </w:p>
     <w:p>
       <w:r>
-        <w:t>What the Monitor tab showed while the load was running:</w:t>
-      </w:r>
-    </w:p>
-    <w:p>
-      <w:pPr>
-        <w:pStyle w:val="ListBullet"/>
-      </w:pPr>
-      <w:r>
-        <w:t>Used heap shot up to the 128 MB ceiling within a couple of seconds and stayed pinned there.</w:t>
-      </w:r>
-    </w:p>
-    <w:p>
-      <w:pPr>
-        <w:pStyle w:val="ListBullet"/>
-      </w:pPr>
-      <w:r>
-        <w:t>The heap graph had a very tight sawtooth shape, which means collections were happening one after another with almost no gap.</w:t>
-      </w:r>
-    </w:p>
-    <w:p>
-      <w:pPr>
-        <w:pStyle w:val="ListBullet"/>
-      </w:pPr>
-      <w:r>
-        <w:t>CPU usage was high, but the GC activity portion of the graph was taking most of it rather than the application itself.</w:t>
-      </w:r>
-    </w:p>
-    <w:p>
-      <w:pPr>
-        <w:pStyle w:val="ListBullet"/>
-      </w:pPr>
-      <w:r>
-        <w:t>Thread count stayed flat at around 30, so threads were not the problem.</w:t>
-      </w:r>
-    </w:p>
-    <w:p>
-      <w:pPr>
-        <w:spacing w:before="120" w:after="40"/>
-        <w:jc w:val="center"/>
-        <w:shd w:val="clear" w:fill="FAFAFA"/>
-      </w:pPr>
-      <w:r>
-        <w:rPr>
-          <w:rFonts w:ascii="Consolas" w:hAnsi="Consolas"/>
-          <w:b/>
-          <w:color w:val="808080"/>
-          <w:sz w:val="20"/>
-        </w:rPr>
-        <w:t>[  PASTE SCREENSHOT HERE  ]</w:t>
-      </w:r>
-    </w:p>
-    <w:p>
-      <w:pPr>
-        <w:spacing w:after="240"/>
-        <w:jc w:val="center"/>
-      </w:pPr>
-      <w:r>
-        <w:rPr>
-          <w:i/>
-          <w:color w:val="595959"/>
-          <w:sz w:val="18"/>
-        </w:rPr>
-        <w:t>Figure 2: VisualVM Monitor tab under load, heap capped at 128 MB</w:t>
-      </w:r>
-    </w:p>
-    <w:p>
-      <w:pPr>
-        <w:spacing w:before="120" w:after="40"/>
-        <w:jc w:val="center"/>
-        <w:shd w:val="clear" w:fill="FAFAFA"/>
-      </w:pPr>
-      <w:r>
-        <w:rPr>
-          <w:rFonts w:ascii="Consolas" w:hAnsi="Consolas"/>
-          <w:b/>
-          <w:color w:val="808080"/>
-          <w:sz w:val="20"/>
-        </w:rPr>
-        <w:t>[  PASTE SCREENSHOT HERE  ]</w:t>
-      </w:r>
-    </w:p>
-    <w:p>
-      <w:pPr>
-        <w:spacing w:after="240"/>
-        <w:jc w:val="center"/>
-      </w:pPr>
-      <w:r>
-        <w:rPr>
-          <w:i/>
-          <w:color w:val="595959"/>
-          <w:sz w:val="18"/>
-        </w:rPr>
-        <w:t>Figure 3: CPU graph showing GC activity taking most of the CPU time</w:t>
+        <w:t>The log told a much harsher story than the 7.2 percent on screen. Over the monitored session the JVM ran 3,137 collections, 695 of them full GCs, and the pauses added up to 95.5 seconds. During the busiest ten second stretch the application was stopped for 68 percent of the time.</w:t>
       </w:r>
     </w:p>
     <w:p>
       <w:r>
-        <w:t>Reading exact pause times off a graph is guesswork, so I also turned on GC logging to get real numbers to put next to the screenshots:</w:t>
-      </w:r>
-    </w:p>
-    <w:p>
-      <w:pPr>
-        <w:spacing w:after="200" w:before="0"/>
-        <w:ind w:left="360"/>
-        <w:shd w:val="clear" w:fill="F2F2F2"/>
-      </w:pPr>
-      <w:r>
-        <w:rPr>
-          <w:rFonts w:ascii="Consolas" w:hAnsi="Consolas"/>
-          <w:sz w:val="19"/>
-        </w:rPr>
-        <w:t>-Xlog:gc:file=gc.log:time,level,tags</w:t>
-      </w:r>
-    </w:p>
-    <w:p>
-      <w:r>
-        <w:t>The log made the problem obvious. During the 11.65 second test the JVM ran 369 collections, and 76 of those were full GCs. Added together the pauses came to 9,812 ms. That means the application was stopped for roughly 84 percent of the run. The bottleneck was not my code and it was not CPU or threads, it was simply that the heap was far too small for the amount of garbage the endpoint produces.</w:t>
+        <w:t>It took me a while to work out why those two numbers disagree so badly, and the answer is that they measure different things. The serial collector pauses the application and then does its work on a single thread. This machine has 8 cores, and VisualVM reports GC activity as a share of total CPU capacity across all of them. One core fully busy out of eight is about 12 percent of capacity, so 68 percent of wall time on one core lands near the 7 percent VisualVM displayed. The graph was not wrong, it just answers "how much of my CPU is going into GC" while the log answers "how much of the time is my application frozen". For a service that has to respond to requests, the second question is the one that matters.</w:t>
       </w:r>
     </w:p>
     <w:p>
@@ -625,10 +709,10 @@
         <w:tblLook w:firstColumn="1" w:firstRow="1" w:lastColumn="0" w:lastRow="0" w:noHBand="0" w:noVBand="1" w:val="04A0"/>
       </w:tblPr>
       <w:tblGrid>
-        <w:gridCol w:w="2160"/>
-        <w:gridCol w:w="2160"/>
-        <w:gridCol w:w="2160"/>
-        <w:gridCol w:w="2160"/>
+        <w:gridCol w:w="2340"/>
+        <w:gridCol w:w="2340"/>
+        <w:gridCol w:w="2340"/>
+        <w:gridCol w:w="2340"/>
       </w:tblGrid>
       <w:tr>
         <w:tc>
@@ -963,6 +1047,20 @@
     </w:p>
     <w:p>
       <w:pPr>
+        <w:spacing w:after="0" w:before="0"/>
+        <w:ind w:left="360"/>
+        <w:shd w:val="clear" w:fill="F2F2F2"/>
+      </w:pPr>
+      <w:r>
+        <w:rPr>
+          <w:rFonts w:ascii="Consolas" w:hAnsi="Consolas"/>
+          <w:sz w:val="19"/>
+        </w:rPr>
+        <w:t xml:space="preserve">     -cp "target/classes:$(cat cp.txt)" \</w:t>
+      </w:r>
+    </w:p>
+    <w:p>
+      <w:pPr>
         <w:spacing w:after="200" w:before="0"/>
         <w:ind w:left="360"/>
         <w:shd w:val="clear" w:fill="F2F2F2"/>
@@ -972,33 +1070,52 @@
           <w:rFonts w:ascii="Consolas" w:hAnsi="Consolas"/>
           <w:sz w:val="19"/>
         </w:rPr>
-        <w:t xml:space="preserve">     -jar target/itemservice-0.0.1-SNAPSHOT.jar</w:t>
-      </w:r>
-    </w:p>
-    <w:p>
-      <w:r>
-        <w:t>I ran the same load script again with VisualVM attached. This time the heap graph looked completely different. Used heap moved between roughly 60 MB and 200 MB inside the 512 MB space, with clear gaps between collections instead of a solid band, and the GC portion of the CPU graph dropped to a thin line.</w:t>
+        <w:t xml:space="preserve">     com.example.itemservice.ItemserviceApplication</w:t>
       </w:r>
     </w:p>
     <w:p>
       <w:pPr>
-        <w:spacing w:before="120" w:after="40"/>
+        <w:spacing w:before="160" w:after="40"/>
         <w:jc w:val="center"/>
-        <w:shd w:val="clear" w:fill="FAFAFA"/>
       </w:pPr>
       <w:r>
-        <w:rPr>
-          <w:rFonts w:ascii="Consolas" w:hAnsi="Consolas"/>
-          <w:b/>
-          <w:color w:val="808080"/>
-          <w:sz w:val="20"/>
-        </w:rPr>
-        <w:t>[  PASTE SCREENSHOT HERE  ]</w:t>
+        <w:drawing>
+          <wp:inline xmlns:a="http://schemas.openxmlformats.org/drawingml/2006/main" xmlns:pic="http://schemas.openxmlformats.org/drawingml/2006/picture">
+            <wp:extent cx="5760720" cy="1832956"/>
+            <wp:docPr id="4" name="Picture 4"/>
+            <wp:cNvGraphicFramePr>
+              <a:graphicFrameLocks noChangeAspect="1"/>
+            </wp:cNvGraphicFramePr>
+            <a:graphic>
+              <a:graphicData uri="http://schemas.openxmlformats.org/drawingml/2006/picture">
+                <pic:pic>
+                  <pic:nvPicPr>
+                    <pic:cNvPr id="0" name="fig-tuned-overview.png"/>
+                    <pic:cNvPicPr/>
+                  </pic:nvPicPr>
+                  <pic:blipFill>
+                    <a:blip r:embed="rId12"/>
+                    <a:stretch>
+                      <a:fillRect/>
+                    </a:stretch>
+                  </pic:blipFill>
+                  <pic:spPr>
+                    <a:xfrm>
+                      <a:off x="0" y="0"/>
+                      <a:ext cx="5760720" cy="1832956"/>
+                    </a:xfrm>
+                    <a:prstGeom prst="rect"/>
+                  </pic:spPr>
+                </pic:pic>
+              </a:graphicData>
+            </a:graphic>
+          </wp:inline>
+        </w:drawing>
       </w:r>
     </w:p>
     <w:p>
       <w:pPr>
-        <w:spacing w:after="240"/>
+        <w:spacing w:after="280"/>
         <w:jc w:val="center"/>
       </w:pPr>
       <w:r>
@@ -1007,7 +1124,71 @@
           <w:color w:val="595959"/>
           <w:sz w:val="18"/>
         </w:rPr>
-        <w:t>Figure 4: VisualVM Monitor tab after tuning, heap with room to breathe</w:t>
+        <w:t>Figure 4: Overview tab for the tuned run, confirming the new flags are in effect</w:t>
+      </w:r>
+    </w:p>
+    <w:p>
+      <w:r>
+        <w:t>I attached VisualVM again and ran exactly the same load. The Monitor tab looked like a different application.</w:t>
+      </w:r>
+    </w:p>
+    <w:p>
+      <w:pPr>
+        <w:spacing w:before="160" w:after="40"/>
+        <w:jc w:val="center"/>
+      </w:pPr>
+      <w:r>
+        <w:drawing>
+          <wp:inline xmlns:a="http://schemas.openxmlformats.org/drawingml/2006/main" xmlns:pic="http://schemas.openxmlformats.org/drawingml/2006/picture">
+            <wp:extent cx="5760720" cy="3831752"/>
+            <wp:docPr id="5" name="Picture 5"/>
+            <wp:cNvGraphicFramePr>
+              <a:graphicFrameLocks noChangeAspect="1"/>
+            </wp:cNvGraphicFramePr>
+            <a:graphic>
+              <a:graphicData uri="http://schemas.openxmlformats.org/drawingml/2006/picture">
+                <pic:pic>
+                  <pic:nvPicPr>
+                    <pic:cNvPr id="0" name="fig-tuned-monitor.png"/>
+                    <pic:cNvPicPr/>
+                  </pic:nvPicPr>
+                  <pic:blipFill>
+                    <a:blip r:embed="rId13"/>
+                    <a:stretch>
+                      <a:fillRect/>
+                    </a:stretch>
+                  </pic:blipFill>
+                  <pic:spPr>
+                    <a:xfrm>
+                      <a:off x="0" y="0"/>
+                      <a:ext cx="5760720" cy="3831752"/>
+                    </a:xfrm>
+                    <a:prstGeom prst="rect"/>
+                  </pic:spPr>
+                </pic:pic>
+              </a:graphicData>
+            </a:graphic>
+          </wp:inline>
+        </w:drawing>
+      </w:r>
+    </w:p>
+    <w:p>
+      <w:pPr>
+        <w:spacing w:after="280"/>
+        <w:jc w:val="center"/>
+      </w:pPr>
+      <w:r>
+        <w:rPr>
+          <w:i/>
+          <w:color w:val="595959"/>
+          <w:sz w:val="18"/>
+        </w:rPr>
+        <w:t>Figure 5: Monitor tab during the tuned run. Used heap now swings between roughly 100 MB and 400 MB inside the 512 MB space, with clear gaps between collections, and GC activity has dropped to 0.1 percent</w:t>
+      </w:r>
+    </w:p>
+    <w:p>
+      <w:r>
+        <w:t>Max heap now reads 536,870,912 B. Used heap rises and falls between about 100 MB and 400 MB with visible gaps instead of a solid band, which means the collector gets to wait between cycles rather than running constantly. GC activity fell from 7.2 percent to 0.1 percent, and CPU usage actually went up slightly, from 34 percent to 39 percent. That sounds wrong until you think about it: the CPU is now doing useful work answering requests instead of collecting garbage.</w:t>
       </w:r>
     </w:p>
     <w:p>
@@ -1020,7 +1201,7 @@
     </w:p>
     <w:p>
       <w:r>
-        <w:t>Same code, same load script, same machine. The only difference between the two columns is the JVM flags.</w:t>
+        <w:t>The two monitored sessions above ran the same load for the same length of time, so the GC logs from them can be compared directly.</w:t>
       </w:r>
     </w:p>
     <w:tbl>
@@ -1031,10 +1212,397 @@
         <w:tblLook w:firstColumn="1" w:firstRow="1" w:lastColumn="0" w:lastRow="0" w:noHBand="0" w:noVBand="1" w:val="04A0"/>
       </w:tblPr>
       <w:tblGrid>
-        <w:gridCol w:w="2160"/>
-        <w:gridCol w:w="2160"/>
-        <w:gridCol w:w="2160"/>
-        <w:gridCol w:w="2160"/>
+        <w:gridCol w:w="3120"/>
+        <w:gridCol w:w="3120"/>
+        <w:gridCol w:w="3120"/>
+      </w:tblGrid>
+      <w:tr>
+        <w:tc>
+          <w:tcPr>
+            <w:tcW w:type="dxa" w:w="3744"/>
+          </w:tcPr>
+          <w:p>
+            <w:pPr>
+              <w:shd w:val="clear" w:fill="DDDDDD"/>
+            </w:pPr>
+            <w:r/>
+            <w:r>
+              <w:rPr>
+                <w:b/>
+                <w:sz w:val="20"/>
+              </w:rPr>
+              <w:t>Monitored session</w:t>
+            </w:r>
+          </w:p>
+        </w:tc>
+        <w:tc>
+          <w:tcPr>
+            <w:tcW w:type="dxa" w:w="2736"/>
+          </w:tcPr>
+          <w:p>
+            <w:pPr>
+              <w:shd w:val="clear" w:fill="DDDDDD"/>
+            </w:pPr>
+            <w:r/>
+            <w:r>
+              <w:rPr>
+                <w:b/>
+                <w:sz w:val="20"/>
+              </w:rPr>
+              <w:t>Baseline</w:t>
+            </w:r>
+          </w:p>
+        </w:tc>
+        <w:tc>
+          <w:tcPr>
+            <w:tcW w:type="dxa" w:w="2736"/>
+          </w:tcPr>
+          <w:p>
+            <w:pPr>
+              <w:shd w:val="clear" w:fill="DDDDDD"/>
+            </w:pPr>
+            <w:r/>
+            <w:r>
+              <w:rPr>
+                <w:b/>
+                <w:sz w:val="20"/>
+              </w:rPr>
+              <w:t>Tuned</w:t>
+            </w:r>
+          </w:p>
+        </w:tc>
+      </w:tr>
+      <w:tr>
+        <w:tc>
+          <w:tcPr>
+            <w:tcW w:type="dxa" w:w="3744"/>
+          </w:tcPr>
+          <w:p>
+            <w:r/>
+            <w:r>
+              <w:rPr>
+                <w:sz w:val="20"/>
+              </w:rPr>
+              <w:t>Max heap (from VisualVM)</w:t>
+            </w:r>
+          </w:p>
+        </w:tc>
+        <w:tc>
+          <w:tcPr>
+            <w:tcW w:type="dxa" w:w="2736"/>
+          </w:tcPr>
+          <w:p>
+            <w:r/>
+            <w:r>
+              <w:rPr>
+                <w:sz w:val="20"/>
+              </w:rPr>
+              <w:t>134,217,728 B</w:t>
+            </w:r>
+          </w:p>
+        </w:tc>
+        <w:tc>
+          <w:tcPr>
+            <w:tcW w:type="dxa" w:w="2736"/>
+          </w:tcPr>
+          <w:p>
+            <w:r/>
+            <w:r>
+              <w:rPr>
+                <w:sz w:val="20"/>
+              </w:rPr>
+              <w:t>536,870,912 B</w:t>
+            </w:r>
+          </w:p>
+        </w:tc>
+      </w:tr>
+      <w:tr>
+        <w:tc>
+          <w:tcPr>
+            <w:tcW w:type="dxa" w:w="3744"/>
+          </w:tcPr>
+          <w:p>
+            <w:r/>
+            <w:r>
+              <w:rPr>
+                <w:sz w:val="20"/>
+              </w:rPr>
+              <w:t>GC activity (from VisualVM)</w:t>
+            </w:r>
+          </w:p>
+        </w:tc>
+        <w:tc>
+          <w:tcPr>
+            <w:tcW w:type="dxa" w:w="2736"/>
+          </w:tcPr>
+          <w:p>
+            <w:r/>
+            <w:r>
+              <w:rPr>
+                <w:sz w:val="20"/>
+              </w:rPr>
+              <w:t>7.2%</w:t>
+            </w:r>
+          </w:p>
+        </w:tc>
+        <w:tc>
+          <w:tcPr>
+            <w:tcW w:type="dxa" w:w="2736"/>
+          </w:tcPr>
+          <w:p>
+            <w:r/>
+            <w:r>
+              <w:rPr>
+                <w:sz w:val="20"/>
+              </w:rPr>
+              <w:t>0.1%</w:t>
+            </w:r>
+          </w:p>
+        </w:tc>
+      </w:tr>
+      <w:tr>
+        <w:tc>
+          <w:tcPr>
+            <w:tcW w:type="dxa" w:w="3744"/>
+          </w:tcPr>
+          <w:p>
+            <w:r/>
+            <w:r>
+              <w:rPr>
+                <w:sz w:val="20"/>
+              </w:rPr>
+              <w:t>CPU usage (from VisualVM)</w:t>
+            </w:r>
+          </w:p>
+        </w:tc>
+        <w:tc>
+          <w:tcPr>
+            <w:tcW w:type="dxa" w:w="2736"/>
+          </w:tcPr>
+          <w:p>
+            <w:r/>
+            <w:r>
+              <w:rPr>
+                <w:sz w:val="20"/>
+              </w:rPr>
+              <w:t>34.4%</w:t>
+            </w:r>
+          </w:p>
+        </w:tc>
+        <w:tc>
+          <w:tcPr>
+            <w:tcW w:type="dxa" w:w="2736"/>
+          </w:tcPr>
+          <w:p>
+            <w:r/>
+            <w:r>
+              <w:rPr>
+                <w:sz w:val="20"/>
+              </w:rPr>
+              <w:t>39.0%</w:t>
+            </w:r>
+          </w:p>
+        </w:tc>
+      </w:tr>
+      <w:tr>
+        <w:tc>
+          <w:tcPr>
+            <w:tcW w:type="dxa" w:w="3744"/>
+          </w:tcPr>
+          <w:p>
+            <w:r/>
+            <w:r>
+              <w:rPr>
+                <w:sz w:val="20"/>
+              </w:rPr>
+              <w:t>Collections</w:t>
+            </w:r>
+          </w:p>
+        </w:tc>
+        <w:tc>
+          <w:tcPr>
+            <w:tcW w:type="dxa" w:w="2736"/>
+          </w:tcPr>
+          <w:p>
+            <w:r/>
+            <w:r>
+              <w:rPr>
+                <w:sz w:val="20"/>
+              </w:rPr>
+              <w:t>3,137</w:t>
+            </w:r>
+          </w:p>
+        </w:tc>
+        <w:tc>
+          <w:tcPr>
+            <w:tcW w:type="dxa" w:w="2736"/>
+          </w:tcPr>
+          <w:p>
+            <w:r/>
+            <w:r>
+              <w:rPr>
+                <w:sz w:val="20"/>
+              </w:rPr>
+              <w:t>458</w:t>
+            </w:r>
+          </w:p>
+        </w:tc>
+      </w:tr>
+      <w:tr>
+        <w:tc>
+          <w:tcPr>
+            <w:tcW w:type="dxa" w:w="3744"/>
+          </w:tcPr>
+          <w:p>
+            <w:r/>
+            <w:r>
+              <w:rPr>
+                <w:sz w:val="20"/>
+              </w:rPr>
+              <w:t>Full GCs</w:t>
+            </w:r>
+          </w:p>
+        </w:tc>
+        <w:tc>
+          <w:tcPr>
+            <w:tcW w:type="dxa" w:w="2736"/>
+          </w:tcPr>
+          <w:p>
+            <w:r/>
+            <w:r>
+              <w:rPr>
+                <w:sz w:val="20"/>
+              </w:rPr>
+              <w:t>695</w:t>
+            </w:r>
+          </w:p>
+        </w:tc>
+        <w:tc>
+          <w:tcPr>
+            <w:tcW w:type="dxa" w:w="2736"/>
+          </w:tcPr>
+          <w:p>
+            <w:r/>
+            <w:r>
+              <w:rPr>
+                <w:sz w:val="20"/>
+              </w:rPr>
+              <w:t>0</w:t>
+            </w:r>
+          </w:p>
+        </w:tc>
+      </w:tr>
+      <w:tr>
+        <w:tc>
+          <w:tcPr>
+            <w:tcW w:type="dxa" w:w="3744"/>
+          </w:tcPr>
+          <w:p>
+            <w:r/>
+            <w:r>
+              <w:rPr>
+                <w:sz w:val="20"/>
+              </w:rPr>
+              <w:t>Total stop-the-world pause</w:t>
+            </w:r>
+          </w:p>
+        </w:tc>
+        <w:tc>
+          <w:tcPr>
+            <w:tcW w:type="dxa" w:w="2736"/>
+          </w:tcPr>
+          <w:p>
+            <w:r/>
+            <w:r>
+              <w:rPr>
+                <w:sz w:val="20"/>
+              </w:rPr>
+              <w:t>95.5 s</w:t>
+            </w:r>
+          </w:p>
+        </w:tc>
+        <w:tc>
+          <w:tcPr>
+            <w:tcW w:type="dxa" w:w="2736"/>
+          </w:tcPr>
+          <w:p>
+            <w:r/>
+            <w:r>
+              <w:rPr>
+                <w:sz w:val="20"/>
+              </w:rPr>
+              <w:t>2.3 s</w:t>
+            </w:r>
+          </w:p>
+        </w:tc>
+      </w:tr>
+      <w:tr>
+        <w:tc>
+          <w:tcPr>
+            <w:tcW w:type="dxa" w:w="3744"/>
+          </w:tcPr>
+          <w:p>
+            <w:r/>
+            <w:r>
+              <w:rPr>
+                <w:sz w:val="20"/>
+              </w:rPr>
+              <w:t>Pause share, busiest 10 s</w:t>
+            </w:r>
+          </w:p>
+        </w:tc>
+        <w:tc>
+          <w:tcPr>
+            <w:tcW w:type="dxa" w:w="2736"/>
+          </w:tcPr>
+          <w:p>
+            <w:r/>
+            <w:r>
+              <w:rPr>
+                <w:sz w:val="20"/>
+              </w:rPr>
+              <w:t>68%</w:t>
+            </w:r>
+          </w:p>
+        </w:tc>
+        <w:tc>
+          <w:tcPr>
+            <w:tcW w:type="dxa" w:w="2736"/>
+          </w:tcPr>
+          <w:p>
+            <w:r/>
+            <w:r>
+              <w:rPr>
+                <w:sz w:val="20"/>
+              </w:rPr>
+              <w:t>3%</w:t>
+            </w:r>
+          </w:p>
+        </w:tc>
+      </w:tr>
+    </w:tbl>
+    <w:p>
+      <w:pPr>
+        <w:spacing w:after="80"/>
+      </w:pPr>
+    </w:p>
+    <w:p>
+      <w:r>
+        <w:t>Screenshots show behaviour but not throughput, so I also ran the load test on its own with VisualVM detached, 1,200 requests with 16 concurrent threads at 25,000 items each. Same code, same machine. The only difference between the columns is the JVM flags.</w:t>
+      </w:r>
+    </w:p>
+    <w:tbl>
+      <w:tblPr>
+        <w:tblStyle w:val="TableGrid"/>
+        <w:tblW w:type="auto" w:w="0"/>
+        <w:jc w:val="center"/>
+        <w:tblLook w:firstColumn="1" w:firstRow="1" w:lastColumn="0" w:lastRow="0" w:noHBand="0" w:noVBand="1" w:val="04A0"/>
+      </w:tblPr>
+      <w:tblGrid>
+        <w:gridCol w:w="2340"/>
+        <w:gridCol w:w="2340"/>
+        <w:gridCol w:w="2340"/>
+        <w:gridCol w:w="2340"/>
       </w:tblGrid>
       <w:tr>
         <w:tc>
@@ -1469,7 +2037,7 @@
               <w:rPr>
                 <w:sz w:val="20"/>
               </w:rPr>
-              <w:t>Garbage collections</w:t>
+              <w:t>Collections</w:t>
             </w:r>
           </w:p>
         </w:tc>
@@ -1585,7 +2153,7 @@
               <w:rPr>
                 <w:sz w:val="20"/>
               </w:rPr>
-              <w:t>Total time paused for GC</w:t>
+              <w:t>Total stop-the-world pause</w:t>
             </w:r>
           </w:p>
         </w:tc>
@@ -1613,7 +2181,7 @@
               <w:rPr>
                 <w:sz w:val="20"/>
               </w:rPr>
-              <w:t>236 ms</w:t>
+              <w:t>191 ms</w:t>
             </w:r>
           </w:p>
         </w:tc>
@@ -1627,7 +2195,7 @@
               <w:rPr>
                 <w:sz w:val="20"/>
               </w:rPr>
-              <w:t>97% lower</w:t>
+              <w:t>98% lower</w:t>
             </w:r>
           </w:p>
         </w:tc>
@@ -1640,7 +2208,12 @@
     </w:p>
     <w:p>
       <w:r>
-        <w:t>The full GC count is the number I find most telling. A full GC stops every application thread while it collects the entire heap, and there were 76 of them before the change and none at all after. The 95th percentile dropping from 287.7 ms to 115.3 ms is the same story seen from the user side, since those long pauses were exactly what made the slowest requests slow.</w:t>
+        <w:t>The full GC count is the number I find most telling. A full GC stops every application thread while it collects the entire heap, and there were 76 of them before the change and none at all after. The 95th percentile dropping from 287.7 ms to 115.3 ms is the same story seen from the user's side, because those long pauses were exactly what made the slowest requests slow.</w:t>
+      </w:r>
+    </w:p>
+    <w:p>
+      <w:r>
+        <w:t>One detail worth being careful about: the 9,812 ms of pause was measured across the 18.9 seconds that the GC log covers, which includes the warm-up requests as well as the measured ones, so it works out to 52 percent of that window rather than the 84 percent I first calculated by dividing it by the 11.65 second measured phase alone. I also had to separate G1's concurrent phases from its stop-the-world pauses when adding up the tuned figure, since concurrent work does not freeze the application and counting it would have overstated the pause total by about 45 ms.</w:t>
       </w:r>
     </w:p>
     <w:p>
@@ -1653,7 +2226,7 @@
     </w:p>
     <w:p>
       <w:r>
-        <w:t>Before the heavy test I had run a lighter one, 2,000 requests of 5,000 items each. Those numbers were much less exciting:</w:t>
+        <w:t>Before the heavy test I had run a lighter one, 2,000 requests of 5,000 items each with 8 threads. Those numbers were much less exciting:</w:t>
       </w:r>
     </w:p>
     <w:tbl>
@@ -1664,9 +2237,9 @@
         <w:tblLook w:firstColumn="1" w:firstRow="1" w:lastColumn="0" w:lastRow="0" w:noHBand="0" w:noVBand="1" w:val="04A0"/>
       </w:tblPr>
       <w:tblGrid>
-        <w:gridCol w:w="2880"/>
-        <w:gridCol w:w="2880"/>
-        <w:gridCol w:w="2880"/>
+        <w:gridCol w:w="3120"/>
+        <w:gridCol w:w="3120"/>
+        <w:gridCol w:w="3120"/>
       </w:tblGrid>
       <w:tr>
         <w:tc>
@@ -1823,7 +2396,7 @@
               <w:rPr>
                 <w:sz w:val="20"/>
               </w:rPr>
-              <w:t>Garbage collections</w:t>
+              <w:t>Collections</w:t>
             </w:r>
           </w:p>
         </w:tc>
@@ -1911,7 +2484,7 @@
               <w:rPr>
                 <w:sz w:val="20"/>
               </w:rPr>
-              <w:t>Total time paused for GC</w:t>
+              <w:t>Total stop-the-world pause</w:t>
             </w:r>
           </w:p>
         </w:tc>
@@ -1925,7 +2498,7 @@
               <w:rPr>
                 <w:sz w:val="20"/>
               </w:rPr>
-              <w:t>483.1 ms</w:t>
+              <w:t>483 ms</w:t>
             </w:r>
           </w:p>
         </w:tc>
@@ -1939,7 +2512,7 @@
               <w:rPr>
                 <w:sz w:val="20"/>
               </w:rPr>
-              <w:t>139.2 ms</w:t>
+              <w:t>102 ms</w:t>
             </w:r>
           </w:p>
         </w:tc>
@@ -1976,7 +2549,7 @@
         <w:pStyle w:val="ListBullet"/>
       </w:pPr>
       <w:r>
-        <w:t>Measure before changing anything. If I had jumped straight to changing flags I would have had no way of knowing whether it helped, and no idea which flag was responsible.</w:t>
+        <w:t>Measure before changing anything. If I had jumped straight to changing flags I would have had no way of knowing whether it helped, or which flag was responsible.</w:t>
       </w:r>
     </w:p>
     <w:p>
@@ -1984,7 +2557,15 @@
         <w:pStyle w:val="ListBullet"/>
       </w:pPr>
       <w:r>
-        <w:t>Graphs and logs answer different questions. VisualVM was what showed me where to look, since I could see the heap pinned at its limit and the thread count sitting flat. But for numbers I could actually put in a table, the GC log was far better than trying to read values off a moving chart.</w:t>
+        <w:t>Check what a percentage is actually a percentage of. The 7.2 percent GC activity in VisualVM looked harmless next to a log showing the application frozen 68 percent of the time. Both were correct, because one is a share of eight cores and the other is a share of elapsed time.</w:t>
+      </w:r>
+    </w:p>
+    <w:p>
+      <w:pPr>
+        <w:pStyle w:val="ListBullet"/>
+      </w:pPr>
+      <w:r>
+        <w:t>Graphs and logs answer different questions. VisualVM showed me where to look, since I could see the heap pinned at its limit and the thread count sitting flat. For numbers I could put in a table, the GC log was far better than reading values off a moving chart.</w:t>
       </w:r>
     </w:p>
     <w:p>
@@ -1993,6 +2574,14 @@
       </w:pPr>
       <w:r>
         <w:t>Full GC count is a more useful warning sign than heap usage. A heap sitting near its limit is not automatically a problem, that can just be the collector being efficient. Repeated full GCs are, because each one freezes the whole application.</w:t>
+      </w:r>
+    </w:p>
+    <w:p>
+      <w:pPr>
+        <w:pStyle w:val="ListBullet"/>
+      </w:pPr>
+      <w:r>
+        <w:t>Rising CPU can be a good sign. CPU went up from 34 to 39 percent after tuning, which looks like a regression until you notice throughput went up 68 percent at the same time. The CPU was finally being spent on requests instead of on garbage collection.</w:t>
       </w:r>
     </w:p>
     <w:p>
@@ -2021,7 +2610,7 @@
     </w:p>
     <w:p>
       <w:r>
-        <w:t>I built a Spring Boot microservice with one REST endpoint, monitored it in VisualVM while it was under load, found that a 128 MB heap with the serial collector was leaving the application paused for most of the test, and fixed it by raising the heap to 512 MB and switching to G1 with a 100 ms pause target. That took throughput from 103 to 173.5 requests per second and removed all 76 full GCs. The part I will remember is that the exact same change made no difference under lighter load, so the measurement mattered as much as the fix.</w:t>
+        <w:t>I built a Spring Boot microservice with one REST endpoint, monitored it in VisualVM while it was under load, found that a 128 MB heap with the serial collector was leaving the application frozen for most of the test, and fixed it by raising the heap to 512 MB and switching to G1 with a 100 ms pause target. That took throughput from 103 to 173.5 requests per second and removed all 76 full GCs. The parts I will remember are that the same change made no difference under lighter load, and that the most alarming-looking number on the VisualVM dashboard was not the one that mattered.</w:t>
       </w:r>
     </w:p>
     <w:p>
@@ -2128,7 +2717,7 @@
     </w:p>
     <w:p>
       <w:r>
-        <w:t>Load in both cases came from loadtest.py (1,200 requests, 16 concurrent, count=25000). Counting the collections and adding up the pauses afterwards:</w:t>
+        <w:t>Load came from loadtest.py (1,200 requests, 16 concurrent, count=25000). Counting the collections and the stop-the-world pauses afterwards, note that matching on "Pause" is what keeps G1's concurrent phases out of the total:</w:t>
       </w:r>
     </w:p>
     <w:p>
@@ -2161,6 +2750,20 @@
     </w:p>
     <w:p>
       <w:pPr>
+        <w:spacing w:after="0" w:before="0"/>
+        <w:ind w:left="360"/>
+        <w:shd w:val="clear" w:fill="F2F2F2"/>
+      </w:pPr>
+      <w:r>
+        <w:rPr>
+          <w:rFonts w:ascii="Consolas" w:hAnsi="Consolas"/>
+          <w:sz w:val="19"/>
+        </w:rPr>
+        <w:t>grep -oP 'Pause (Young|Full).*?\K\d+\.\d+(?=ms)' baseline-gc.log \</w:t>
+      </w:r>
+    </w:p>
+    <w:p>
+      <w:pPr>
         <w:spacing w:after="200" w:before="0"/>
         <w:ind w:left="360"/>
         <w:shd w:val="clear" w:fill="F2F2F2"/>
@@ -2170,12 +2773,12 @@
           <w:rFonts w:ascii="Consolas" w:hAnsi="Consolas"/>
           <w:sz w:val="19"/>
         </w:rPr>
-        <w:t>grep -oP '\d+\.\d+(?=ms)' baseline-gc.log | awk '{s+=$1} END {print s}'</w:t>
+        <w:t xml:space="preserve">    | awk '{s+=$1} END {print s " ms"}'</w:t>
       </w:r>
     </w:p>
     <w:sectPr>
       <w:pgSz w:w="12240" w:h="15840"/>
-      <w:pgMar w:top="1440" w:right="1800" w:bottom="1440" w:left="1800" w:header="720" w:footer="720" w:gutter="0"/>
+      <w:pgMar w:top="1440" w:right="1440" w:bottom="1440" w:left="1440" w:header="720" w:footer="720" w:gutter="0"/>
       <w:cols w:space="720"/>
       <w:docGrid w:linePitch="360"/>
     </w:sectPr>

</xml_diff>

<commit_message>
Trim the write-up, add name, and include a PDF version
Cuts the document from 9 pages to 5. Four tables down to one, the
numbered section headings and the appendix are gone, and the bullet
lists are folded into plain prose. Same measurements and screenshots,
noticeably less explanation around them.

Adds John Michael Bilbao as the author and a PDF export alongside
the .docx.
</commit_message>
<xml_diff>
--- a/JVM-Tuning-Assignment.docx
+++ b/JVM-Tuning-Assignment.docx
@@ -9,35 +9,35 @@
       <w:r>
         <w:rPr>
           <w:b/>
-          <w:sz w:val="36"/>
+          <w:sz w:val="32"/>
         </w:rPr>
         <w:t>JVM Tuning and Spring Boot Microservice Performance</w:t>
       </w:r>
     </w:p>
     <w:p>
       <w:pPr>
-        <w:spacing w:after="360"/>
+        <w:spacing w:after="320"/>
         <w:jc w:val="center"/>
       </w:pPr>
       <w:r>
         <w:rPr>
           <w:sz w:val="21"/>
         </w:rPr>
-        <w:t>Name: [Your Name]</w:t>
+        <w:t>John Michael Bilbao</w:t>
         <w:br/>
       </w:r>
       <w:r>
         <w:rPr>
           <w:sz w:val="21"/>
         </w:rPr>
-        <w:t>Course / Section: [Course]</w:t>
+        <w:t>[Course / Section]</w:t>
         <w:br/>
       </w:r>
       <w:r>
         <w:rPr>
           <w:sz w:val="21"/>
         </w:rPr>
-        <w:t>Date: [Date]</w:t>
+        <w:t>August 10, 2026</w:t>
       </w:r>
     </w:p>
     <w:p>
@@ -45,33 +45,17 @@
         <w:pStyle w:val="Heading1"/>
       </w:pPr>
       <w:r>
-        <w:t>1. Introduction</w:t>
+        <w:t>Introduction</w:t>
       </w:r>
     </w:p>
     <w:p>
       <w:r>
-        <w:t>A microservice is a small application that does one job and communicates over HTTP. I used Spring Boot to build one because it comes with an embedded Tomcat server and sets up most of the configuration on its own, so a working REST endpoint only takes a few lines of code.</w:t>
+        <w:t>A microservice is just a small application that does one job and talks over HTTP. I used Spring Boot for this one because it comes with Tomcat built in and handles most of the setup itself, so the whole service is only a few lines of code.</w:t>
       </w:r>
     </w:p>
     <w:p>
       <w:r>
-        <w:t>Every Spring Boot application runs inside the JVM, and the JVM is what decides how much memory the application can use and when it throws away objects that are no longer needed. That cleanup is called garbage collection. When the heap is too small for the workload, the collector has to run over and over, and the application ends up spending more time freeing memory than answering requests. JVM tuning is the process of setting options such as the heap size and the collector type so the application matches the work it actually does.</w:t>
-      </w:r>
-    </w:p>
-    <w:p>
-      <w:r>
-        <w:t>For this assignment I built a small item service, put it under load, watched it in VisualVM, then changed the JVM settings and measured the difference.</w:t>
-      </w:r>
-    </w:p>
-    <w:p>
-      <w:r>
-        <w:rPr>
-          <w:b/>
-        </w:rPr>
-        <w:t xml:space="preserve">Environment: </w:t>
-      </w:r>
-      <w:r>
-        <w:t>Java 21.0.2 (OpenJDK), Spring Boot 3.4.1, Maven 3.9, VisualVM 2.2, 8 CPU cores, 31 GB RAM.</w:t>
+        <w:t>Spring Boot runs on the JVM, and the JVM is what decides how much memory the application gets and when it clears out objects that are no longer needed. That clearing out is garbage collection. If the heap is too small the collector keeps running, and the application spends more time freeing memory than answering requests. Tuning means setting options like the heap size and the collector type to fit the work the application actually does. I built a small item service, put it under load, watched it in VisualVM, then changed the settings and measured what happened. Everything here ran on Java 21 with Spring Boot 3.4.1, on a machine with 8 cores and 31 GB of RAM.</w:t>
       </w:r>
     </w:p>
     <w:p>
@@ -79,12 +63,12 @@
         <w:pStyle w:val="Heading1"/>
       </w:pPr>
       <w:r>
-        <w:t>2. Step 1: Building the Microservice</w:t>
+        <w:t>The microservice</w:t>
       </w:r>
     </w:p>
     <w:p>
       <w:r>
-        <w:t>I created a Maven project with the Spring Web and Spring Boot Actuator dependencies. The whole service is three classes. The controller is the only part that really matters:</w:t>
+        <w:t>It is a Maven project with the Spring Web and Actuator dependencies. Three classes, and the controller is the only interesting one:</w:t>
       </w:r>
     </w:p>
     <w:p>
@@ -341,50 +325,12 @@
     </w:p>
     <w:p>
       <w:r>
-        <w:t>Item itself is just a record with an id, name, category and price. The endpoint is GET /api/items?count=5000 and it returns the list as JSON.</w:t>
+        <w:t>Item is a record with an id, name, category and price. The endpoint is GET /api/items?count=5000 and it returns the list as JSON.</w:t>
       </w:r>
     </w:p>
     <w:p>
       <w:r>
-        <w:t>One thing I did on purpose: the list is rebuilt on every single request instead of being cached. If I cached it the service would barely allocate anything and there would be nothing interesting to look at in VisualVM. Rebuilding it means every request creates thousands of short lived objects, which is what puts pressure on the garbage collector.</w:t>
-      </w:r>
-    </w:p>
-    <w:p>
-      <w:r>
-        <w:t>Building and running it:</w:t>
-      </w:r>
-    </w:p>
-    <w:p>
-      <w:pPr>
-        <w:spacing w:after="0" w:before="0"/>
-        <w:ind w:left="360"/>
-        <w:shd w:val="clear" w:fill="F2F2F2"/>
-      </w:pPr>
-      <w:r>
-        <w:rPr>
-          <w:rFonts w:ascii="Consolas" w:hAnsi="Consolas"/>
-          <w:sz w:val="19"/>
-        </w:rPr>
-        <w:t>mvn package -DskipTests</w:t>
-      </w:r>
-    </w:p>
-    <w:p>
-      <w:pPr>
-        <w:spacing w:after="200" w:before="0"/>
-        <w:ind w:left="360"/>
-        <w:shd w:val="clear" w:fill="F2F2F2"/>
-      </w:pPr>
-      <w:r>
-        <w:rPr>
-          <w:rFonts w:ascii="Consolas" w:hAnsi="Consolas"/>
-          <w:sz w:val="19"/>
-        </w:rPr>
-        <w:t>java -jar target/itemservice-0.0.1-SNAPSHOT.jar</w:t>
-      </w:r>
-    </w:p>
-    <w:p>
-      <w:r>
-        <w:t>I checked the endpoint worked before worrying about performance. A full 5,000 item response comes back as 349 KB of JSON in about 43 ms when the service is not under load.</w:t>
+        <w:t>The list gets rebuilt on every request instead of being cached, which is on purpose. A cached list would barely allocate anything and there would be nothing to watch in VisualVM. Rebuilding it means every request throws away thousands of objects.</w:t>
       </w:r>
     </w:p>
     <w:p>
@@ -438,7 +384,7 @@
           <w:color w:val="595959"/>
           <w:sz w:val="18"/>
         </w:rPr>
-        <w:t>Figure 1: The endpoint returning JSON, the size and timing of a 5,000 item response, and the Actuator health check</w:t>
+        <w:t>Figure 1: The endpoint responding, and the health check</w:t>
       </w:r>
     </w:p>
     <w:p>
@@ -446,17 +392,12 @@
         <w:pStyle w:val="Heading1"/>
       </w:pPr>
       <w:r>
-        <w:t>3. Step 2: Monitoring with VisualVM</w:t>
+        <w:t>Monitoring with VisualVM</w:t>
       </w:r>
     </w:p>
     <w:p>
       <w:r>
-        <w:t>I downloaded VisualVM from visualvm.github.io and started it while the service was already running. The local Java process shows up in the panel on the left, listed by its main class. Double clicking it opens the application, and the Overview tab is a good place to start because it confirms which JVM options the process is actually running with.</w:t>
-      </w:r>
-    </w:p>
-    <w:p>
-      <w:r>
-        <w:t>For the first run I started the service with a deliberately small heap and the serial collector, so the problem would be easy to see:</w:t>
+        <w:t>I got VisualVM from visualvm.github.io and started it while the service was already running. The process shows up on the left under Local, and double clicking it opens the Overview tab, which is handy because it shows the JVM options the process actually started with. I ran the first round with a small heap and the serial collector so there would be something to find:</w:t>
       </w:r>
     </w:p>
     <w:p>
@@ -552,12 +493,12 @@
           <w:color w:val="595959"/>
           <w:sz w:val="18"/>
         </w:rPr>
-        <w:t>Figure 2: Overview tab for the baseline run. The JVM arguments panel confirms -Xms64m, -Xmx128m and -XX:+UseSerialGC</w:t>
+        <w:t>Figure 2: Overview tab, showing the baseline flags in effect</w:t>
       </w:r>
     </w:p>
     <w:p>
       <w:r>
-        <w:t>An idle application does not show much, so I needed traffic. I wrote a short Python script that sends requests with 16 threads asking for 25,000 items each, and I ran it in a loop so the load stayed constant for about two and a half minutes while I watched the Monitor tab.</w:t>
+        <w:t>Nothing much happens while the application is idle, so I wrote a Python script that hits the endpoint with 16 threads asking for 25,000 items each, and left it looping for about two and a half minutes while I watched the Monitor tab.</w:t>
       </w:r>
     </w:p>
     <w:p>
@@ -568,7 +509,7 @@
       <w:r>
         <w:drawing>
           <wp:inline xmlns:a="http://schemas.openxmlformats.org/drawingml/2006/main" xmlns:pic="http://schemas.openxmlformats.org/drawingml/2006/picture">
-            <wp:extent cx="5760720" cy="3831752"/>
+            <wp:extent cx="5394960" cy="3588466"/>
             <wp:docPr id="3" name="Picture 3"/>
             <wp:cNvGraphicFramePr>
               <a:graphicFrameLocks noChangeAspect="1"/>
@@ -589,7 +530,7 @@
                   <pic:spPr>
                     <a:xfrm>
                       <a:off x="0" y="0"/>
-                      <a:ext cx="5760720" cy="3831752"/>
+                      <a:ext cx="5394960" cy="3588466"/>
                     </a:xfrm>
                     <a:prstGeom prst="rect"/>
                   </pic:spPr>
@@ -611,81 +552,17 @@
           <w:color w:val="595959"/>
           <w:sz w:val="18"/>
         </w:rPr>
-        <w:t>Figure 3: Monitor tab during the baseline run. Heap is pinned at its 128 MB ceiling and used heap sawtooths violently between roughly 25 MB and 100 MB</w:t>
+        <w:t>Figure 3: Monitor tab during the baseline run</w:t>
       </w:r>
     </w:p>
     <w:p>
       <w:r>
-        <w:t>What the Monitor tab showed once the load started:</w:t>
-      </w:r>
-    </w:p>
-    <w:p>
-      <w:pPr>
-        <w:pStyle w:val="ListBullet"/>
-      </w:pPr>
-      <w:r>
-        <w:t>Heap size jumped straight to the ceiling and stayed there. Size and Max both read 134,217,728 B, which is the 128 MB I asked for.</w:t>
-      </w:r>
-    </w:p>
-    <w:p>
-      <w:pPr>
-        <w:pStyle w:val="ListBullet"/>
-      </w:pPr>
-      <w:r>
-        <w:t>Used heap sawtoothed between roughly 25 MB and 100 MB and never settled, so the collector was reclaiming memory continuously rather than in occasional bursts.</w:t>
-      </w:r>
-    </w:p>
-    <w:p>
-      <w:pPr>
-        <w:pStyle w:val="ListBullet"/>
-      </w:pPr>
-      <w:r>
-        <w:t>CPU usage sat around 34 percent and GC activity was reported at 7.2 percent.</w:t>
-      </w:r>
-    </w:p>
-    <w:p>
-      <w:pPr>
-        <w:pStyle w:val="ListBullet"/>
-      </w:pPr>
-      <w:r>
-        <w:t>Live threads went from 29 to 37 when the load arrived and then stayed flat, so thread count was not the problem.</w:t>
-      </w:r>
-    </w:p>
-    <w:p>
-      <w:pPr>
-        <w:pStyle w:val="Heading2"/>
-      </w:pPr>
-      <w:r>
-        <w:t>Why the GC activity percentage looked deceptively small</w:t>
+        <w:t>Heap went straight to the 128 MB ceiling and stayed pinned there. Used heap sawtoothed between roughly 25 and 100 MB and never settled, so the collector was running constantly rather than every now and then. CPU sat around 34 percent, and threads went from 29 to 37 when the load arrived and then stayed flat, so the thread count was not the problem.</w:t>
       </w:r>
     </w:p>
     <w:p>
       <w:r>
-        <w:t>Reading exact pause times off a moving graph is guesswork, so I also turned on GC logging:</w:t>
-      </w:r>
-    </w:p>
-    <w:p>
-      <w:pPr>
-        <w:spacing w:after="200" w:before="0"/>
-        <w:ind w:left="360"/>
-        <w:shd w:val="clear" w:fill="F2F2F2"/>
-      </w:pPr>
-      <w:r>
-        <w:rPr>
-          <w:rFonts w:ascii="Consolas" w:hAnsi="Consolas"/>
-          <w:sz w:val="19"/>
-        </w:rPr>
-        <w:t>-Xlog:gc:file=baseline-gc.log:time,level,tags</w:t>
-      </w:r>
-    </w:p>
-    <w:p>
-      <w:r>
-        <w:t>The log told a much harsher story than the 7.2 percent on screen. Over the monitored session the JVM ran 3,137 collections, 695 of them full GCs, and the pauses added up to 95.5 seconds. During the busiest ten second stretch the application was stopped for 68 percent of the time.</w:t>
-      </w:r>
-    </w:p>
-    <w:p>
-      <w:r>
-        <w:t>It took me a while to work out why those two numbers disagree so badly, and the answer is that they measure different things. The serial collector pauses the application and then does its work on a single thread. This machine has 8 cores, and VisualVM reports GC activity as a share of total CPU capacity across all of them. One core fully busy out of eight is about 12 percent of capacity, so 68 percent of wall time on one core lands near the 7 percent VisualVM displayed. The graph was not wrong, it just answers "how much of my CPU is going into GC" while the log answers "how much of the time is my application frozen". For a service that has to respond to requests, the second question is the one that matters.</w:t>
+        <w:t>The GC activity figure confused me at first. VisualVM showed 7.2 percent, which sounds harmless, but the GC log for the same session recorded 3,137 collections, 695 of them full GCs, and 95.5 seconds of pauses. During the busiest ten seconds the application was frozen 68 percent of the time. Both numbers are right. Serial GC stops everything and then works on a single thread, and VisualVM reports GC time spread across all 8 cores, so one fully busy core comes out at around 7 percent. The graph answers how much of the CPU is going into GC, and the log answers how long the application is frozen. For a service that has to answer requests, the second one is what matters.</w:t>
       </w:r>
     </w:p>
     <w:p>
@@ -693,342 +570,12 @@
         <w:pStyle w:val="Heading1"/>
       </w:pPr>
       <w:r>
-        <w:t>4. Step 3: Optimizing the JVM Settings</w:t>
+        <w:t>Changing the settings</w:t>
       </w:r>
     </w:p>
     <w:p>
       <w:r>
-        <w:t>Based on what VisualVM and the GC log showed, I changed the settings like this:</w:t>
-      </w:r>
-    </w:p>
-    <w:tbl>
-      <w:tblPr>
-        <w:tblStyle w:val="TableGrid"/>
-        <w:tblW w:type="auto" w:w="0"/>
-        <w:jc w:val="center"/>
-        <w:tblLook w:firstColumn="1" w:firstRow="1" w:lastColumn="0" w:lastRow="0" w:noHBand="0" w:noVBand="1" w:val="04A0"/>
-      </w:tblPr>
-      <w:tblGrid>
-        <w:gridCol w:w="2340"/>
-        <w:gridCol w:w="2340"/>
-        <w:gridCol w:w="2340"/>
-        <w:gridCol w:w="2340"/>
-      </w:tblGrid>
-      <w:tr>
-        <w:tc>
-          <w:tcPr>
-            <w:tcW w:type="dxa" w:w="1584"/>
-          </w:tcPr>
-          <w:p>
-            <w:pPr>
-              <w:shd w:val="clear" w:fill="DDDDDD"/>
-            </w:pPr>
-            <w:r/>
-            <w:r>
-              <w:rPr>
-                <w:b/>
-                <w:sz w:val="20"/>
-              </w:rPr>
-              <w:t>Setting</w:t>
-            </w:r>
-          </w:p>
-        </w:tc>
-        <w:tc>
-          <w:tcPr>
-            <w:tcW w:type="dxa" w:w="1656"/>
-          </w:tcPr>
-          <w:p>
-            <w:pPr>
-              <w:shd w:val="clear" w:fill="DDDDDD"/>
-            </w:pPr>
-            <w:r/>
-            <w:r>
-              <w:rPr>
-                <w:b/>
-                <w:sz w:val="20"/>
-              </w:rPr>
-              <w:t>Before</w:t>
-            </w:r>
-          </w:p>
-        </w:tc>
-        <w:tc>
-          <w:tcPr>
-            <w:tcW w:type="dxa" w:w="1656"/>
-          </w:tcPr>
-          <w:p>
-            <w:pPr>
-              <w:shd w:val="clear" w:fill="DDDDDD"/>
-            </w:pPr>
-            <w:r/>
-            <w:r>
-              <w:rPr>
-                <w:b/>
-                <w:sz w:val="20"/>
-              </w:rPr>
-              <w:t>After</w:t>
-            </w:r>
-          </w:p>
-        </w:tc>
-        <w:tc>
-          <w:tcPr>
-            <w:tcW w:type="dxa" w:w="4176"/>
-          </w:tcPr>
-          <w:p>
-            <w:pPr>
-              <w:shd w:val="clear" w:fill="DDDDDD"/>
-            </w:pPr>
-            <w:r/>
-            <w:r>
-              <w:rPr>
-                <w:b/>
-                <w:sz w:val="20"/>
-              </w:rPr>
-              <w:t>Why</w:t>
-            </w:r>
-          </w:p>
-        </w:tc>
-      </w:tr>
-      <w:tr>
-        <w:tc>
-          <w:tcPr>
-            <w:tcW w:type="dxa" w:w="1584"/>
-          </w:tcPr>
-          <w:p>
-            <w:r/>
-            <w:r>
-              <w:rPr>
-                <w:sz w:val="20"/>
-              </w:rPr>
-              <w:t>Initial heap</w:t>
-            </w:r>
-          </w:p>
-        </w:tc>
-        <w:tc>
-          <w:tcPr>
-            <w:tcW w:type="dxa" w:w="1656"/>
-          </w:tcPr>
-          <w:p>
-            <w:r/>
-            <w:r>
-              <w:rPr>
-                <w:sz w:val="20"/>
-              </w:rPr>
-              <w:t>-Xms64m</w:t>
-            </w:r>
-          </w:p>
-        </w:tc>
-        <w:tc>
-          <w:tcPr>
-            <w:tcW w:type="dxa" w:w="1656"/>
-          </w:tcPr>
-          <w:p>
-            <w:r/>
-            <w:r>
-              <w:rPr>
-                <w:sz w:val="20"/>
-              </w:rPr>
-              <w:t>-Xms512m</w:t>
-            </w:r>
-          </w:p>
-        </w:tc>
-        <w:tc>
-          <w:tcPr>
-            <w:tcW w:type="dxa" w:w="4176"/>
-          </w:tcPr>
-          <w:p>
-            <w:r/>
-            <w:r>
-              <w:rPr>
-                <w:sz w:val="20"/>
-              </w:rPr>
-              <w:t>Starting equal to the maximum stops the JVM from repeatedly growing the heap while it is already busy.</w:t>
-            </w:r>
-          </w:p>
-        </w:tc>
-      </w:tr>
-      <w:tr>
-        <w:tc>
-          <w:tcPr>
-            <w:tcW w:type="dxa" w:w="1584"/>
-          </w:tcPr>
-          <w:p>
-            <w:r/>
-            <w:r>
-              <w:rPr>
-                <w:sz w:val="20"/>
-              </w:rPr>
-              <w:t>Maximum heap</w:t>
-            </w:r>
-          </w:p>
-        </w:tc>
-        <w:tc>
-          <w:tcPr>
-            <w:tcW w:type="dxa" w:w="1656"/>
-          </w:tcPr>
-          <w:p>
-            <w:r/>
-            <w:r>
-              <w:rPr>
-                <w:sz w:val="20"/>
-              </w:rPr>
-              <w:t>-Xmx128m</w:t>
-            </w:r>
-          </w:p>
-        </w:tc>
-        <w:tc>
-          <w:tcPr>
-            <w:tcW w:type="dxa" w:w="1656"/>
-          </w:tcPr>
-          <w:p>
-            <w:r/>
-            <w:r>
-              <w:rPr>
-                <w:sz w:val="20"/>
-              </w:rPr>
-              <w:t>-Xmx512m</w:t>
-            </w:r>
-          </w:p>
-        </w:tc>
-        <w:tc>
-          <w:tcPr>
-            <w:tcW w:type="dxa" w:w="4176"/>
-          </w:tcPr>
-          <w:p>
-            <w:r/>
-            <w:r>
-              <w:rPr>
-                <w:sz w:val="20"/>
-              </w:rPr>
-              <w:t>The real fix. There was never enough room for the short lived objects, so collections never stopped.</w:t>
-            </w:r>
-          </w:p>
-        </w:tc>
-      </w:tr>
-      <w:tr>
-        <w:tc>
-          <w:tcPr>
-            <w:tcW w:type="dxa" w:w="1584"/>
-          </w:tcPr>
-          <w:p>
-            <w:r/>
-            <w:r>
-              <w:rPr>
-                <w:sz w:val="20"/>
-              </w:rPr>
-              <w:t>Collector</w:t>
-            </w:r>
-          </w:p>
-        </w:tc>
-        <w:tc>
-          <w:tcPr>
-            <w:tcW w:type="dxa" w:w="1656"/>
-          </w:tcPr>
-          <w:p>
-            <w:r/>
-            <w:r>
-              <w:rPr>
-                <w:sz w:val="20"/>
-              </w:rPr>
-              <w:t>-XX:+UseSerialGC</w:t>
-            </w:r>
-          </w:p>
-        </w:tc>
-        <w:tc>
-          <w:tcPr>
-            <w:tcW w:type="dxa" w:w="1656"/>
-          </w:tcPr>
-          <w:p>
-            <w:r/>
-            <w:r>
-              <w:rPr>
-                <w:sz w:val="20"/>
-              </w:rPr>
-              <w:t>-XX:+UseG1GC</w:t>
-            </w:r>
-          </w:p>
-        </w:tc>
-        <w:tc>
-          <w:tcPr>
-            <w:tcW w:type="dxa" w:w="4176"/>
-          </w:tcPr>
-          <w:p>
-            <w:r/>
-            <w:r>
-              <w:rPr>
-                <w:sz w:val="20"/>
-              </w:rPr>
-              <w:t>Serial GC uses one thread and stops the whole application. G1 works in parallel across cores and does much of its work concurrently.</w:t>
-            </w:r>
-          </w:p>
-        </w:tc>
-      </w:tr>
-      <w:tr>
-        <w:tc>
-          <w:tcPr>
-            <w:tcW w:type="dxa" w:w="1584"/>
-          </w:tcPr>
-          <w:p>
-            <w:r/>
-            <w:r>
-              <w:rPr>
-                <w:sz w:val="20"/>
-              </w:rPr>
-              <w:t>Pause target</w:t>
-            </w:r>
-          </w:p>
-        </w:tc>
-        <w:tc>
-          <w:tcPr>
-            <w:tcW w:type="dxa" w:w="1656"/>
-          </w:tcPr>
-          <w:p>
-            <w:r/>
-            <w:r>
-              <w:rPr>
-                <w:sz w:val="20"/>
-              </w:rPr>
-              <w:t>not set</w:t>
-            </w:r>
-          </w:p>
-        </w:tc>
-        <w:tc>
-          <w:tcPr>
-            <w:tcW w:type="dxa" w:w="1656"/>
-          </w:tcPr>
-          <w:p>
-            <w:r/>
-            <w:r>
-              <w:rPr>
-                <w:sz w:val="20"/>
-              </w:rPr>
-              <w:t>-XX:MaxGCPauseMillis=100</w:t>
-            </w:r>
-          </w:p>
-        </w:tc>
-        <w:tc>
-          <w:tcPr>
-            <w:tcW w:type="dxa" w:w="4176"/>
-          </w:tcPr>
-          <w:p>
-            <w:r/>
-            <w:r>
-              <w:rPr>
-                <w:sz w:val="20"/>
-              </w:rPr>
-              <w:t>Tells G1 to aim for pauses under 100 ms, which it balances by resizing its regions.</w:t>
-            </w:r>
-          </w:p>
-        </w:tc>
-      </w:tr>
-    </w:tbl>
-    <w:p>
-      <w:pPr>
-        <w:spacing w:after="80"/>
-      </w:pPr>
-    </w:p>
-    <w:p>
-      <w:r>
-        <w:t>The tuned command:</w:t>
+        <w:t>The heap was the problem, not CPU and not threads. I raised the maximum from 128 MB to 512 MB and set the minimum to match, which stops the JVM growing the heap while it is already busy. I also swapped the serial collector for G1, since G1 spreads its work across cores and does much of it concurrently, and gave it a 100 ms pause target.</w:t>
       </w:r>
     </w:p>
     <w:p>
@@ -1124,12 +671,7 @@
           <w:color w:val="595959"/>
           <w:sz w:val="18"/>
         </w:rPr>
-        <w:t>Figure 4: Overview tab for the tuned run, confirming the new flags are in effect</w:t>
-      </w:r>
-    </w:p>
-    <w:p>
-      <w:r>
-        <w:t>I attached VisualVM again and ran exactly the same load. The Monitor tab looked like a different application.</w:t>
+        <w:t>Figure 4: Overview tab after the change</w:t>
       </w:r>
     </w:p>
     <w:p>
@@ -1140,7 +682,7 @@
       <w:r>
         <w:drawing>
           <wp:inline xmlns:a="http://schemas.openxmlformats.org/drawingml/2006/main" xmlns:pic="http://schemas.openxmlformats.org/drawingml/2006/picture">
-            <wp:extent cx="5760720" cy="3831752"/>
+            <wp:extent cx="5394960" cy="3588466"/>
             <wp:docPr id="5" name="Picture 5"/>
             <wp:cNvGraphicFramePr>
               <a:graphicFrameLocks noChangeAspect="1"/>
@@ -1161,7 +703,7 @@
                   <pic:spPr>
                     <a:xfrm>
                       <a:off x="0" y="0"/>
-                      <a:ext cx="5760720" cy="3831752"/>
+                      <a:ext cx="5394960" cy="3588466"/>
                     </a:xfrm>
                     <a:prstGeom prst="rect"/>
                   </pic:spPr>
@@ -1183,12 +725,12 @@
           <w:color w:val="595959"/>
           <w:sz w:val="18"/>
         </w:rPr>
-        <w:t>Figure 5: Monitor tab during the tuned run. Used heap now swings between roughly 100 MB and 400 MB inside the 512 MB space, with clear gaps between collections, and GC activity has dropped to 0.1 percent</w:t>
+        <w:t>Figure 5: Monitor tab during the tuned run</w:t>
       </w:r>
     </w:p>
     <w:p>
       <w:r>
-        <w:t>Max heap now reads 536,870,912 B. Used heap rises and falls between about 100 MB and 400 MB with visible gaps instead of a solid band, which means the collector gets to wait between cycles rather than running constantly. GC activity fell from 7.2 percent to 0.1 percent, and CPU usage actually went up slightly, from 34 percent to 39 percent. That sounds wrong until you think about it: the CPU is now doing useful work answering requests instead of collecting garbage.</w:t>
+        <w:t>Used heap now moves between about 100 and 400 MB with visible gaps instead of one solid band, so the collector gets to rest between cycles. GC activity dropped from 7.2 percent to 0.1, full GCs went from 695 to none, and the total pause time fell from 95.5 seconds to 2.3. CPU actually went up a little, from 34 to 39 percent, which looked wrong until I realised the CPU was finally being spent on requests instead of on collecting garbage.</w:t>
       </w:r>
     </w:p>
     <w:p>
@@ -1196,12 +738,12 @@
         <w:pStyle w:val="Heading1"/>
       </w:pPr>
       <w:r>
-        <w:t>5. Results</w:t>
+        <w:t>Results</w:t>
       </w:r>
     </w:p>
     <w:p>
       <w:r>
-        <w:t>The two monitored sessions above ran the same load for the same length of time, so the GC logs from them can be compared directly.</w:t>
+        <w:t>Screenshots show behaviour but not speed, so I ran the load test again with VisualVM detached: 1,200 requests, 16 at a time, 25,000 items each. Same code and same machine, only the flags were different.</w:t>
       </w:r>
     </w:p>
     <w:tbl>
@@ -1219,55 +761,45 @@
       <w:tr>
         <w:tc>
           <w:tcPr>
-            <w:tcW w:type="dxa" w:w="3744"/>
+            <w:tcW w:type="dxa" w:w="3888"/>
           </w:tcPr>
           <w:p>
-            <w:pPr>
-              <w:shd w:val="clear" w:fill="DDDDDD"/>
-            </w:pPr>
             <w:r/>
             <w:r>
               <w:rPr>
                 <w:b/>
                 <w:sz w:val="20"/>
               </w:rPr>
-              <w:t>Monitored session</w:t>
             </w:r>
           </w:p>
         </w:tc>
         <w:tc>
           <w:tcPr>
-            <w:tcW w:type="dxa" w:w="2736"/>
+            <w:tcW w:type="dxa" w:w="2304"/>
           </w:tcPr>
           <w:p>
-            <w:pPr>
-              <w:shd w:val="clear" w:fill="DDDDDD"/>
-            </w:pPr>
             <w:r/>
             <w:r>
               <w:rPr>
                 <w:b/>
                 <w:sz w:val="20"/>
               </w:rPr>
-              <w:t>Baseline</w:t>
+              <w:t>Before</w:t>
             </w:r>
           </w:p>
         </w:tc>
         <w:tc>
           <w:tcPr>
-            <w:tcW w:type="dxa" w:w="2736"/>
+            <w:tcW w:type="dxa" w:w="2304"/>
           </w:tcPr>
           <w:p>
-            <w:pPr>
-              <w:shd w:val="clear" w:fill="DDDDDD"/>
-            </w:pPr>
             <w:r/>
             <w:r>
               <w:rPr>
                 <w:b/>
                 <w:sz w:val="20"/>
               </w:rPr>
-              <w:t>Tuned</w:t>
+              <w:t>After</w:t>
             </w:r>
           </w:p>
         </w:tc>
@@ -1275,7 +807,7 @@
       <w:tr>
         <w:tc>
           <w:tcPr>
-            <w:tcW w:type="dxa" w:w="3744"/>
+            <w:tcW w:type="dxa" w:w="3888"/>
           </w:tcPr>
           <w:p>
             <w:r/>
@@ -1283,13 +815,13 @@
               <w:rPr>
                 <w:sz w:val="20"/>
               </w:rPr>
-              <w:t>Max heap (from VisualVM)</w:t>
+              <w:t>Requests per second</w:t>
             </w:r>
           </w:p>
         </w:tc>
         <w:tc>
           <w:tcPr>
-            <w:tcW w:type="dxa" w:w="2736"/>
+            <w:tcW w:type="dxa" w:w="2304"/>
           </w:tcPr>
           <w:p>
             <w:r/>
@@ -1297,13 +829,13 @@
               <w:rPr>
                 <w:sz w:val="20"/>
               </w:rPr>
-              <w:t>134,217,728 B</w:t>
+              <w:t>103.0</w:t>
             </w:r>
           </w:p>
         </w:tc>
         <w:tc>
           <w:tcPr>
-            <w:tcW w:type="dxa" w:w="2736"/>
+            <w:tcW w:type="dxa" w:w="2304"/>
           </w:tcPr>
           <w:p>
             <w:r/>
@@ -1311,7 +843,7 @@
               <w:rPr>
                 <w:sz w:val="20"/>
               </w:rPr>
-              <w:t>536,870,912 B</w:t>
+              <w:t>173.5</w:t>
             </w:r>
           </w:p>
         </w:tc>
@@ -1319,7 +851,7 @@
       <w:tr>
         <w:tc>
           <w:tcPr>
-            <w:tcW w:type="dxa" w:w="3744"/>
+            <w:tcW w:type="dxa" w:w="3888"/>
           </w:tcPr>
           <w:p>
             <w:r/>
@@ -1327,13 +859,13 @@
               <w:rPr>
                 <w:sz w:val="20"/>
               </w:rPr>
-              <w:t>GC activity (from VisualVM)</w:t>
+              <w:t>Average response time</w:t>
             </w:r>
           </w:p>
         </w:tc>
         <w:tc>
           <w:tcPr>
-            <w:tcW w:type="dxa" w:w="2736"/>
+            <w:tcW w:type="dxa" w:w="2304"/>
           </w:tcPr>
           <w:p>
             <w:r/>
@@ -1341,13 +873,13 @@
               <w:rPr>
                 <w:sz w:val="20"/>
               </w:rPr>
-              <w:t>7.2%</w:t>
+              <w:t>155.0 ms</w:t>
             </w:r>
           </w:p>
         </w:tc>
         <w:tc>
           <w:tcPr>
-            <w:tcW w:type="dxa" w:w="2736"/>
+            <w:tcW w:type="dxa" w:w="2304"/>
           </w:tcPr>
           <w:p>
             <w:r/>
@@ -1355,7 +887,7 @@
               <w:rPr>
                 <w:sz w:val="20"/>
               </w:rPr>
-              <w:t>0.1%</w:t>
+              <w:t>92.0 ms</w:t>
             </w:r>
           </w:p>
         </w:tc>
@@ -1363,7 +895,7 @@
       <w:tr>
         <w:tc>
           <w:tcPr>
-            <w:tcW w:type="dxa" w:w="3744"/>
+            <w:tcW w:type="dxa" w:w="3888"/>
           </w:tcPr>
           <w:p>
             <w:r/>
@@ -1371,13 +903,13 @@
               <w:rPr>
                 <w:sz w:val="20"/>
               </w:rPr>
-              <w:t>CPU usage (from VisualVM)</w:t>
+              <w:t>95th percentile response time</w:t>
             </w:r>
           </w:p>
         </w:tc>
         <w:tc>
           <w:tcPr>
-            <w:tcW w:type="dxa" w:w="2736"/>
+            <w:tcW w:type="dxa" w:w="2304"/>
           </w:tcPr>
           <w:p>
             <w:r/>
@@ -1385,13 +917,13 @@
               <w:rPr>
                 <w:sz w:val="20"/>
               </w:rPr>
-              <w:t>34.4%</w:t>
+              <w:t>287.7 ms</w:t>
             </w:r>
           </w:p>
         </w:tc>
         <w:tc>
           <w:tcPr>
-            <w:tcW w:type="dxa" w:w="2736"/>
+            <w:tcW w:type="dxa" w:w="2304"/>
           </w:tcPr>
           <w:p>
             <w:r/>
@@ -1399,7 +931,7 @@
               <w:rPr>
                 <w:sz w:val="20"/>
               </w:rPr>
-              <w:t>39.0%</w:t>
+              <w:t>115.3 ms</w:t>
             </w:r>
           </w:p>
         </w:tc>
@@ -1407,7 +939,51 @@
       <w:tr>
         <w:tc>
           <w:tcPr>
-            <w:tcW w:type="dxa" w:w="3744"/>
+            <w:tcW w:type="dxa" w:w="3888"/>
+          </w:tcPr>
+          <w:p>
+            <w:r/>
+            <w:r>
+              <w:rPr>
+                <w:sz w:val="20"/>
+              </w:rPr>
+              <w:t>Time to finish 1,200 requests</w:t>
+            </w:r>
+          </w:p>
+        </w:tc>
+        <w:tc>
+          <w:tcPr>
+            <w:tcW w:type="dxa" w:w="2304"/>
+          </w:tcPr>
+          <w:p>
+            <w:r/>
+            <w:r>
+              <w:rPr>
+                <w:sz w:val="20"/>
+              </w:rPr>
+              <w:t>11.65 s</w:t>
+            </w:r>
+          </w:p>
+        </w:tc>
+        <w:tc>
+          <w:tcPr>
+            <w:tcW w:type="dxa" w:w="2304"/>
+          </w:tcPr>
+          <w:p>
+            <w:r/>
+            <w:r>
+              <w:rPr>
+                <w:sz w:val="20"/>
+              </w:rPr>
+              <w:t>6.92 s</w:t>
+            </w:r>
+          </w:p>
+        </w:tc>
+      </w:tr>
+      <w:tr>
+        <w:tc>
+          <w:tcPr>
+            <w:tcW w:type="dxa" w:w="3888"/>
           </w:tcPr>
           <w:p>
             <w:r/>
@@ -1421,7 +997,7 @@
         </w:tc>
         <w:tc>
           <w:tcPr>
-            <w:tcW w:type="dxa" w:w="2736"/>
+            <w:tcW w:type="dxa" w:w="2304"/>
           </w:tcPr>
           <w:p>
             <w:r/>
@@ -1429,13 +1005,13 @@
               <w:rPr>
                 <w:sz w:val="20"/>
               </w:rPr>
-              <w:t>3,137</w:t>
+              <w:t>369</w:t>
             </w:r>
           </w:p>
         </w:tc>
         <w:tc>
           <w:tcPr>
-            <w:tcW w:type="dxa" w:w="2736"/>
+            <w:tcW w:type="dxa" w:w="2304"/>
           </w:tcPr>
           <w:p>
             <w:r/>
@@ -1443,7 +1019,7 @@
               <w:rPr>
                 <w:sz w:val="20"/>
               </w:rPr>
-              <w:t>458</w:t>
+              <w:t>32</w:t>
             </w:r>
           </w:p>
         </w:tc>
@@ -1451,7 +1027,7 @@
       <w:tr>
         <w:tc>
           <w:tcPr>
-            <w:tcW w:type="dxa" w:w="3744"/>
+            <w:tcW w:type="dxa" w:w="3888"/>
           </w:tcPr>
           <w:p>
             <w:r/>
@@ -1465,7 +1041,7 @@
         </w:tc>
         <w:tc>
           <w:tcPr>
-            <w:tcW w:type="dxa" w:w="2736"/>
+            <w:tcW w:type="dxa" w:w="2304"/>
           </w:tcPr>
           <w:p>
             <w:r/>
@@ -1473,13 +1049,13 @@
               <w:rPr>
                 <w:sz w:val="20"/>
               </w:rPr>
-              <w:t>695</w:t>
+              <w:t>76</w:t>
             </w:r>
           </w:p>
         </w:tc>
         <w:tc>
           <w:tcPr>
-            <w:tcW w:type="dxa" w:w="2736"/>
+            <w:tcW w:type="dxa" w:w="2304"/>
           </w:tcPr>
           <w:p>
             <w:r/>
@@ -1495,7 +1071,7 @@
       <w:tr>
         <w:tc>
           <w:tcPr>
-            <w:tcW w:type="dxa" w:w="3744"/>
+            <w:tcW w:type="dxa" w:w="3888"/>
           </w:tcPr>
           <w:p>
             <w:r/>
@@ -1503,663 +1079,13 @@
               <w:rPr>
                 <w:sz w:val="20"/>
               </w:rPr>
-              <w:t>Total stop-the-world pause</w:t>
+              <w:t>Total pause time</w:t>
             </w:r>
           </w:p>
         </w:tc>
         <w:tc>
           <w:tcPr>
-            <w:tcW w:type="dxa" w:w="2736"/>
-          </w:tcPr>
-          <w:p>
-            <w:r/>
-            <w:r>
-              <w:rPr>
-                <w:sz w:val="20"/>
-              </w:rPr>
-              <w:t>95.5 s</w:t>
-            </w:r>
-          </w:p>
-        </w:tc>
-        <w:tc>
-          <w:tcPr>
-            <w:tcW w:type="dxa" w:w="2736"/>
-          </w:tcPr>
-          <w:p>
-            <w:r/>
-            <w:r>
-              <w:rPr>
-                <w:sz w:val="20"/>
-              </w:rPr>
-              <w:t>2.3 s</w:t>
-            </w:r>
-          </w:p>
-        </w:tc>
-      </w:tr>
-      <w:tr>
-        <w:tc>
-          <w:tcPr>
-            <w:tcW w:type="dxa" w:w="3744"/>
-          </w:tcPr>
-          <w:p>
-            <w:r/>
-            <w:r>
-              <w:rPr>
-                <w:sz w:val="20"/>
-              </w:rPr>
-              <w:t>Pause share, busiest 10 s</w:t>
-            </w:r>
-          </w:p>
-        </w:tc>
-        <w:tc>
-          <w:tcPr>
-            <w:tcW w:type="dxa" w:w="2736"/>
-          </w:tcPr>
-          <w:p>
-            <w:r/>
-            <w:r>
-              <w:rPr>
-                <w:sz w:val="20"/>
-              </w:rPr>
-              <w:t>68%</w:t>
-            </w:r>
-          </w:p>
-        </w:tc>
-        <w:tc>
-          <w:tcPr>
-            <w:tcW w:type="dxa" w:w="2736"/>
-          </w:tcPr>
-          <w:p>
-            <w:r/>
-            <w:r>
-              <w:rPr>
-                <w:sz w:val="20"/>
-              </w:rPr>
-              <w:t>3%</w:t>
-            </w:r>
-          </w:p>
-        </w:tc>
-      </w:tr>
-    </w:tbl>
-    <w:p>
-      <w:pPr>
-        <w:spacing w:after="80"/>
-      </w:pPr>
-    </w:p>
-    <w:p>
-      <w:r>
-        <w:t>Screenshots show behaviour but not throughput, so I also ran the load test on its own with VisualVM detached, 1,200 requests with 16 concurrent threads at 25,000 items each. Same code, same machine. The only difference between the columns is the JVM flags.</w:t>
-      </w:r>
-    </w:p>
-    <w:tbl>
-      <w:tblPr>
-        <w:tblStyle w:val="TableGrid"/>
-        <w:tblW w:type="auto" w:w="0"/>
-        <w:jc w:val="center"/>
-        <w:tblLook w:firstColumn="1" w:firstRow="1" w:lastColumn="0" w:lastRow="0" w:noHBand="0" w:noVBand="1" w:val="04A0"/>
-      </w:tblPr>
-      <w:tblGrid>
-        <w:gridCol w:w="2340"/>
-        <w:gridCol w:w="2340"/>
-        <w:gridCol w:w="2340"/>
-        <w:gridCol w:w="2340"/>
-      </w:tblGrid>
-      <w:tr>
-        <w:tc>
-          <w:tcPr>
-            <w:tcW w:type="dxa" w:w="3168"/>
-          </w:tcPr>
-          <w:p>
-            <w:pPr>
-              <w:shd w:val="clear" w:fill="DDDDDD"/>
-            </w:pPr>
-            <w:r/>
-            <w:r>
-              <w:rPr>
-                <w:b/>
-                <w:sz w:val="20"/>
-              </w:rPr>
-              <w:t>Measurement</w:t>
-            </w:r>
-          </w:p>
-        </w:tc>
-        <w:tc>
-          <w:tcPr>
-            <w:tcW w:type="dxa" w:w="2016"/>
-          </w:tcPr>
-          <w:p>
-            <w:pPr>
-              <w:shd w:val="clear" w:fill="DDDDDD"/>
-            </w:pPr>
-            <w:r/>
-            <w:r>
-              <w:rPr>
-                <w:b/>
-                <w:sz w:val="20"/>
-              </w:rPr>
-              <w:t>Before tuning</w:t>
-            </w:r>
-          </w:p>
-        </w:tc>
-        <w:tc>
-          <w:tcPr>
-            <w:tcW w:type="dxa" w:w="2016"/>
-          </w:tcPr>
-          <w:p>
-            <w:pPr>
-              <w:shd w:val="clear" w:fill="DDDDDD"/>
-            </w:pPr>
-            <w:r/>
-            <w:r>
-              <w:rPr>
-                <w:b/>
-                <w:sz w:val="20"/>
-              </w:rPr>
-              <w:t>After tuning</w:t>
-            </w:r>
-          </w:p>
-        </w:tc>
-        <w:tc>
-          <w:tcPr>
-            <w:tcW w:type="dxa" w:w="1872"/>
-          </w:tcPr>
-          <w:p>
-            <w:pPr>
-              <w:shd w:val="clear" w:fill="DDDDDD"/>
-            </w:pPr>
-            <w:r/>
-            <w:r>
-              <w:rPr>
-                <w:b/>
-                <w:sz w:val="20"/>
-              </w:rPr>
-              <w:t>Change</w:t>
-            </w:r>
-          </w:p>
-        </w:tc>
-      </w:tr>
-      <w:tr>
-        <w:tc>
-          <w:tcPr>
-            <w:tcW w:type="dxa" w:w="3168"/>
-          </w:tcPr>
-          <w:p>
-            <w:r/>
-            <w:r>
-              <w:rPr>
-                <w:sz w:val="20"/>
-              </w:rPr>
-              <w:t>Requests handled per second</w:t>
-            </w:r>
-          </w:p>
-        </w:tc>
-        <w:tc>
-          <w:tcPr>
-            <w:tcW w:type="dxa" w:w="2016"/>
-          </w:tcPr>
-          <w:p>
-            <w:r/>
-            <w:r>
-              <w:rPr>
-                <w:sz w:val="20"/>
-              </w:rPr>
-              <w:t>103.0</w:t>
-            </w:r>
-          </w:p>
-        </w:tc>
-        <w:tc>
-          <w:tcPr>
-            <w:tcW w:type="dxa" w:w="2016"/>
-          </w:tcPr>
-          <w:p>
-            <w:r/>
-            <w:r>
-              <w:rPr>
-                <w:sz w:val="20"/>
-              </w:rPr>
-              <w:t>173.5</w:t>
-            </w:r>
-          </w:p>
-        </w:tc>
-        <w:tc>
-          <w:tcPr>
-            <w:tcW w:type="dxa" w:w="1872"/>
-          </w:tcPr>
-          <w:p>
-            <w:r/>
-            <w:r>
-              <w:rPr>
-                <w:sz w:val="20"/>
-              </w:rPr>
-              <w:t>68% faster</w:t>
-            </w:r>
-          </w:p>
-        </w:tc>
-      </w:tr>
-      <w:tr>
-        <w:tc>
-          <w:tcPr>
-            <w:tcW w:type="dxa" w:w="3168"/>
-          </w:tcPr>
-          <w:p>
-            <w:r/>
-            <w:r>
-              <w:rPr>
-                <w:sz w:val="20"/>
-              </w:rPr>
-              <w:t>Average response time</w:t>
-            </w:r>
-          </w:p>
-        </w:tc>
-        <w:tc>
-          <w:tcPr>
-            <w:tcW w:type="dxa" w:w="2016"/>
-          </w:tcPr>
-          <w:p>
-            <w:r/>
-            <w:r>
-              <w:rPr>
-                <w:sz w:val="20"/>
-              </w:rPr>
-              <w:t>155.0 ms</w:t>
-            </w:r>
-          </w:p>
-        </w:tc>
-        <w:tc>
-          <w:tcPr>
-            <w:tcW w:type="dxa" w:w="2016"/>
-          </w:tcPr>
-          <w:p>
-            <w:r/>
-            <w:r>
-              <w:rPr>
-                <w:sz w:val="20"/>
-              </w:rPr>
-              <w:t>92.0 ms</w:t>
-            </w:r>
-          </w:p>
-        </w:tc>
-        <w:tc>
-          <w:tcPr>
-            <w:tcW w:type="dxa" w:w="1872"/>
-          </w:tcPr>
-          <w:p>
-            <w:r/>
-            <w:r>
-              <w:rPr>
-                <w:sz w:val="20"/>
-              </w:rPr>
-              <w:t>41% lower</w:t>
-            </w:r>
-          </w:p>
-        </w:tc>
-      </w:tr>
-      <w:tr>
-        <w:tc>
-          <w:tcPr>
-            <w:tcW w:type="dxa" w:w="3168"/>
-          </w:tcPr>
-          <w:p>
-            <w:r/>
-            <w:r>
-              <w:rPr>
-                <w:sz w:val="20"/>
-              </w:rPr>
-              <w:t>Median (p50) response time</w:t>
-            </w:r>
-          </w:p>
-        </w:tc>
-        <w:tc>
-          <w:tcPr>
-            <w:tcW w:type="dxa" w:w="2016"/>
-          </w:tcPr>
-          <w:p>
-            <w:r/>
-            <w:r>
-              <w:rPr>
-                <w:sz w:val="20"/>
-              </w:rPr>
-              <w:t>161.2 ms</w:t>
-            </w:r>
-          </w:p>
-        </w:tc>
-        <w:tc>
-          <w:tcPr>
-            <w:tcW w:type="dxa" w:w="2016"/>
-          </w:tcPr>
-          <w:p>
-            <w:r/>
-            <w:r>
-              <w:rPr>
-                <w:sz w:val="20"/>
-              </w:rPr>
-              <w:t>92.6 ms</w:t>
-            </w:r>
-          </w:p>
-        </w:tc>
-        <w:tc>
-          <w:tcPr>
-            <w:tcW w:type="dxa" w:w="1872"/>
-          </w:tcPr>
-          <w:p>
-            <w:r/>
-            <w:r>
-              <w:rPr>
-                <w:sz w:val="20"/>
-              </w:rPr>
-              <w:t>43% lower</w:t>
-            </w:r>
-          </w:p>
-        </w:tc>
-      </w:tr>
-      <w:tr>
-        <w:tc>
-          <w:tcPr>
-            <w:tcW w:type="dxa" w:w="3168"/>
-          </w:tcPr>
-          <w:p>
-            <w:r/>
-            <w:r>
-              <w:rPr>
-                <w:sz w:val="20"/>
-              </w:rPr>
-              <w:t>95th percentile response time</w:t>
-            </w:r>
-          </w:p>
-        </w:tc>
-        <w:tc>
-          <w:tcPr>
-            <w:tcW w:type="dxa" w:w="2016"/>
-          </w:tcPr>
-          <w:p>
-            <w:r/>
-            <w:r>
-              <w:rPr>
-                <w:sz w:val="20"/>
-              </w:rPr>
-              <w:t>287.7 ms</w:t>
-            </w:r>
-          </w:p>
-        </w:tc>
-        <w:tc>
-          <w:tcPr>
-            <w:tcW w:type="dxa" w:w="2016"/>
-          </w:tcPr>
-          <w:p>
-            <w:r/>
-            <w:r>
-              <w:rPr>
-                <w:sz w:val="20"/>
-              </w:rPr>
-              <w:t>115.3 ms</w:t>
-            </w:r>
-          </w:p>
-        </w:tc>
-        <w:tc>
-          <w:tcPr>
-            <w:tcW w:type="dxa" w:w="1872"/>
-          </w:tcPr>
-          <w:p>
-            <w:r/>
-            <w:r>
-              <w:rPr>
-                <w:sz w:val="20"/>
-              </w:rPr>
-              <w:t>60% lower</w:t>
-            </w:r>
-          </w:p>
-        </w:tc>
-      </w:tr>
-      <w:tr>
-        <w:tc>
-          <w:tcPr>
-            <w:tcW w:type="dxa" w:w="3168"/>
-          </w:tcPr>
-          <w:p>
-            <w:r/>
-            <w:r>
-              <w:rPr>
-                <w:sz w:val="20"/>
-              </w:rPr>
-              <w:t>Slowest single request</w:t>
-            </w:r>
-          </w:p>
-        </w:tc>
-        <w:tc>
-          <w:tcPr>
-            <w:tcW w:type="dxa" w:w="2016"/>
-          </w:tcPr>
-          <w:p>
-            <w:r/>
-            <w:r>
-              <w:rPr>
-                <w:sz w:val="20"/>
-              </w:rPr>
-              <w:t>454.3 ms</w:t>
-            </w:r>
-          </w:p>
-        </w:tc>
-        <w:tc>
-          <w:tcPr>
-            <w:tcW w:type="dxa" w:w="2016"/>
-          </w:tcPr>
-          <w:p>
-            <w:r/>
-            <w:r>
-              <w:rPr>
-                <w:sz w:val="20"/>
-              </w:rPr>
-              <w:t>173.1 ms</w:t>
-            </w:r>
-          </w:p>
-        </w:tc>
-        <w:tc>
-          <w:tcPr>
-            <w:tcW w:type="dxa" w:w="1872"/>
-          </w:tcPr>
-          <w:p>
-            <w:r/>
-            <w:r>
-              <w:rPr>
-                <w:sz w:val="20"/>
-              </w:rPr>
-              <w:t>62% lower</w:t>
-            </w:r>
-          </w:p>
-        </w:tc>
-      </w:tr>
-      <w:tr>
-        <w:tc>
-          <w:tcPr>
-            <w:tcW w:type="dxa" w:w="3168"/>
-          </w:tcPr>
-          <w:p>
-            <w:r/>
-            <w:r>
-              <w:rPr>
-                <w:sz w:val="20"/>
-              </w:rPr>
-              <w:t>Total time for 1,200 requests</w:t>
-            </w:r>
-          </w:p>
-        </w:tc>
-        <w:tc>
-          <w:tcPr>
-            <w:tcW w:type="dxa" w:w="2016"/>
-          </w:tcPr>
-          <w:p>
-            <w:r/>
-            <w:r>
-              <w:rPr>
-                <w:sz w:val="20"/>
-              </w:rPr>
-              <w:t>11.65 s</w:t>
-            </w:r>
-          </w:p>
-        </w:tc>
-        <w:tc>
-          <w:tcPr>
-            <w:tcW w:type="dxa" w:w="2016"/>
-          </w:tcPr>
-          <w:p>
-            <w:r/>
-            <w:r>
-              <w:rPr>
-                <w:sz w:val="20"/>
-              </w:rPr>
-              <w:t>6.92 s</w:t>
-            </w:r>
-          </w:p>
-        </w:tc>
-        <w:tc>
-          <w:tcPr>
-            <w:tcW w:type="dxa" w:w="1872"/>
-          </w:tcPr>
-          <w:p>
-            <w:r/>
-            <w:r>
-              <w:rPr>
-                <w:sz w:val="20"/>
-              </w:rPr>
-              <w:t>4.73 s saved</w:t>
-            </w:r>
-          </w:p>
-        </w:tc>
-      </w:tr>
-      <w:tr>
-        <w:tc>
-          <w:tcPr>
-            <w:tcW w:type="dxa" w:w="3168"/>
-          </w:tcPr>
-          <w:p>
-            <w:r/>
-            <w:r>
-              <w:rPr>
-                <w:sz w:val="20"/>
-              </w:rPr>
-              <w:t>Collections</w:t>
-            </w:r>
-          </w:p>
-        </w:tc>
-        <w:tc>
-          <w:tcPr>
-            <w:tcW w:type="dxa" w:w="2016"/>
-          </w:tcPr>
-          <w:p>
-            <w:r/>
-            <w:r>
-              <w:rPr>
-                <w:sz w:val="20"/>
-              </w:rPr>
-              <w:t>369</w:t>
-            </w:r>
-          </w:p>
-        </w:tc>
-        <w:tc>
-          <w:tcPr>
-            <w:tcW w:type="dxa" w:w="2016"/>
-          </w:tcPr>
-          <w:p>
-            <w:r/>
-            <w:r>
-              <w:rPr>
-                <w:sz w:val="20"/>
-              </w:rPr>
-              <w:t>32</w:t>
-            </w:r>
-          </w:p>
-        </w:tc>
-        <w:tc>
-          <w:tcPr>
-            <w:tcW w:type="dxa" w:w="1872"/>
-          </w:tcPr>
-          <w:p>
-            <w:r/>
-            <w:r>
-              <w:rPr>
-                <w:sz w:val="20"/>
-              </w:rPr>
-              <w:t>91% fewer</w:t>
-            </w:r>
-          </w:p>
-        </w:tc>
-      </w:tr>
-      <w:tr>
-        <w:tc>
-          <w:tcPr>
-            <w:tcW w:type="dxa" w:w="3168"/>
-          </w:tcPr>
-          <w:p>
-            <w:r/>
-            <w:r>
-              <w:rPr>
-                <w:sz w:val="20"/>
-              </w:rPr>
-              <w:t>Full GCs</w:t>
-            </w:r>
-          </w:p>
-        </w:tc>
-        <w:tc>
-          <w:tcPr>
-            <w:tcW w:type="dxa" w:w="2016"/>
-          </w:tcPr>
-          <w:p>
-            <w:r/>
-            <w:r>
-              <w:rPr>
-                <w:sz w:val="20"/>
-              </w:rPr>
-              <w:t>76</w:t>
-            </w:r>
-          </w:p>
-        </w:tc>
-        <w:tc>
-          <w:tcPr>
-            <w:tcW w:type="dxa" w:w="2016"/>
-          </w:tcPr>
-          <w:p>
-            <w:r/>
-            <w:r>
-              <w:rPr>
-                <w:sz w:val="20"/>
-              </w:rPr>
-              <w:t>0</w:t>
-            </w:r>
-          </w:p>
-        </w:tc>
-        <w:tc>
-          <w:tcPr>
-            <w:tcW w:type="dxa" w:w="1872"/>
-          </w:tcPr>
-          <w:p>
-            <w:r/>
-            <w:r>
-              <w:rPr>
-                <w:sz w:val="20"/>
-              </w:rPr>
-              <w:t>eliminated</w:t>
-            </w:r>
-          </w:p>
-        </w:tc>
-      </w:tr>
-      <w:tr>
-        <w:tc>
-          <w:tcPr>
-            <w:tcW w:type="dxa" w:w="3168"/>
-          </w:tcPr>
-          <w:p>
-            <w:r/>
-            <w:r>
-              <w:rPr>
-                <w:sz w:val="20"/>
-              </w:rPr>
-              <w:t>Total stop-the-world pause</w:t>
-            </w:r>
-          </w:p>
-        </w:tc>
-        <w:tc>
-          <w:tcPr>
-            <w:tcW w:type="dxa" w:w="2016"/>
+            <w:tcW w:type="dxa" w:w="2304"/>
           </w:tcPr>
           <w:p>
             <w:r/>
@@ -2173,7 +1099,7 @@
         </w:tc>
         <w:tc>
           <w:tcPr>
-            <w:tcW w:type="dxa" w:w="2016"/>
+            <w:tcW w:type="dxa" w:w="2304"/>
           </w:tcPr>
           <w:p>
             <w:r/>
@@ -2185,347 +1111,22 @@
             </w:r>
           </w:p>
         </w:tc>
-        <w:tc>
-          <w:tcPr>
-            <w:tcW w:type="dxa" w:w="1872"/>
-          </w:tcPr>
-          <w:p>
-            <w:r/>
-            <w:r>
-              <w:rPr>
-                <w:sz w:val="20"/>
-              </w:rPr>
-              <w:t>98% lower</w:t>
-            </w:r>
-          </w:p>
-        </w:tc>
       </w:tr>
     </w:tbl>
-    <w:p>
-      <w:pPr>
-        <w:spacing w:after="80"/>
-      </w:pPr>
-    </w:p>
+    <w:p/>
     <w:p>
       <w:r>
-        <w:t>The full GC count is the number I find most telling. A full GC stops every application thread while it collects the entire heap, and there were 76 of them before the change and none at all after. The 95th percentile dropping from 287.7 ms to 115.3 ms is the same story seen from the user's side, because those long pauses were exactly what made the slowest requests slow.</w:t>
+        <w:t>76 full GCs before and none after is the number that stands out. Each one freezes every thread, and that is what made the slowest requests slow, which is why the 95th percentile came down from 287.7 ms to 115.3 ms.</w:t>
       </w:r>
     </w:p>
     <w:p>
       <w:r>
-        <w:t>One detail worth being careful about: the 9,812 ms of pause was measured across the 18.9 seconds that the GC log covers, which includes the warm-up requests as well as the measured ones, so it works out to 52 percent of that window rather than the 84 percent I first calculated by dividing it by the 11.65 second measured phase alone. I also had to separate G1's concurrent phases from its stop-the-world pauses when adding up the tuned figure, since concurrent work does not freeze the application and counting it would have overstated the pause total by about 45 ms.</w:t>
-      </w:r>
-    </w:p>
-    <w:p>
-      <w:pPr>
-        <w:pStyle w:val="Heading2"/>
-      </w:pPr>
-      <w:r>
-        <w:t>A result I did not expect</w:t>
+        <w:t>Two things I had to be careful about when reading the log. The pause total covers the 18.9 seconds the log spans rather than just the 11.65 seconds of measured requests, so it works out to 52 percent of that window and not the much higher figure I got the first time. And G1 logs its concurrent phases alongside its pauses, and concurrent work does not stop the application, so counting those would have made the tuned total look about 45 ms worse than it really is.</w:t>
       </w:r>
     </w:p>
     <w:p>
       <w:r>
-        <w:t>Before the heavy test I had run a lighter one, 2,000 requests of 5,000 items each with 8 threads. Those numbers were much less exciting:</w:t>
-      </w:r>
-    </w:p>
-    <w:tbl>
-      <w:tblPr>
-        <w:tblStyle w:val="TableGrid"/>
-        <w:tblW w:type="auto" w:w="0"/>
-        <w:jc w:val="center"/>
-        <w:tblLook w:firstColumn="1" w:firstRow="1" w:lastColumn="0" w:lastRow="0" w:noHBand="0" w:noVBand="1" w:val="04A0"/>
-      </w:tblPr>
-      <w:tblGrid>
-        <w:gridCol w:w="3120"/>
-        <w:gridCol w:w="3120"/>
-        <w:gridCol w:w="3120"/>
-      </w:tblGrid>
-      <w:tr>
-        <w:tc>
-          <w:tcPr>
-            <w:tcW w:type="dxa" w:w="3456"/>
-          </w:tcPr>
-          <w:p>
-            <w:pPr>
-              <w:shd w:val="clear" w:fill="DDDDDD"/>
-            </w:pPr>
-            <w:r/>
-            <w:r>
-              <w:rPr>
-                <w:b/>
-                <w:sz w:val="20"/>
-              </w:rPr>
-              <w:t>Measurement</w:t>
-            </w:r>
-          </w:p>
-        </w:tc>
-        <w:tc>
-          <w:tcPr>
-            <w:tcW w:type="dxa" w:w="2448"/>
-          </w:tcPr>
-          <w:p>
-            <w:pPr>
-              <w:shd w:val="clear" w:fill="DDDDDD"/>
-            </w:pPr>
-            <w:r/>
-            <w:r>
-              <w:rPr>
-                <w:b/>
-                <w:sz w:val="20"/>
-              </w:rPr>
-              <w:t>Before tuning</w:t>
-            </w:r>
-          </w:p>
-        </w:tc>
-        <w:tc>
-          <w:tcPr>
-            <w:tcW w:type="dxa" w:w="2448"/>
-          </w:tcPr>
-          <w:p>
-            <w:pPr>
-              <w:shd w:val="clear" w:fill="DDDDDD"/>
-            </w:pPr>
-            <w:r/>
-            <w:r>
-              <w:rPr>
-                <w:b/>
-                <w:sz w:val="20"/>
-              </w:rPr>
-              <w:t>After tuning</w:t>
-            </w:r>
-          </w:p>
-        </w:tc>
-      </w:tr>
-      <w:tr>
-        <w:tc>
-          <w:tcPr>
-            <w:tcW w:type="dxa" w:w="3456"/>
-          </w:tcPr>
-          <w:p>
-            <w:r/>
-            <w:r>
-              <w:rPr>
-                <w:sz w:val="20"/>
-              </w:rPr>
-              <w:t>Requests per second</w:t>
-            </w:r>
-          </w:p>
-        </w:tc>
-        <w:tc>
-          <w:tcPr>
-            <w:tcW w:type="dxa" w:w="2448"/>
-          </w:tcPr>
-          <w:p>
-            <w:r/>
-            <w:r>
-              <w:rPr>
-                <w:sz w:val="20"/>
-              </w:rPr>
-              <w:t>577.2</w:t>
-            </w:r>
-          </w:p>
-        </w:tc>
-        <w:tc>
-          <w:tcPr>
-            <w:tcW w:type="dxa" w:w="2448"/>
-          </w:tcPr>
-          <w:p>
-            <w:r/>
-            <w:r>
-              <w:rPr>
-                <w:sz w:val="20"/>
-              </w:rPr>
-              <w:t>571.3</w:t>
-            </w:r>
-          </w:p>
-        </w:tc>
-      </w:tr>
-      <w:tr>
-        <w:tc>
-          <w:tcPr>
-            <w:tcW w:type="dxa" w:w="3456"/>
-          </w:tcPr>
-          <w:p>
-            <w:r/>
-            <w:r>
-              <w:rPr>
-                <w:sz w:val="20"/>
-              </w:rPr>
-              <w:t>Average response time</w:t>
-            </w:r>
-          </w:p>
-        </w:tc>
-        <w:tc>
-          <w:tcPr>
-            <w:tcW w:type="dxa" w:w="2448"/>
-          </w:tcPr>
-          <w:p>
-            <w:r/>
-            <w:r>
-              <w:rPr>
-                <w:sz w:val="20"/>
-              </w:rPr>
-              <w:t>13.8 ms</w:t>
-            </w:r>
-          </w:p>
-        </w:tc>
-        <w:tc>
-          <w:tcPr>
-            <w:tcW w:type="dxa" w:w="2448"/>
-          </w:tcPr>
-          <w:p>
-            <w:r/>
-            <w:r>
-              <w:rPr>
-                <w:sz w:val="20"/>
-              </w:rPr>
-              <w:t>14.0 ms</w:t>
-            </w:r>
-          </w:p>
-        </w:tc>
-      </w:tr>
-      <w:tr>
-        <w:tc>
-          <w:tcPr>
-            <w:tcW w:type="dxa" w:w="3456"/>
-          </w:tcPr>
-          <w:p>
-            <w:r/>
-            <w:r>
-              <w:rPr>
-                <w:sz w:val="20"/>
-              </w:rPr>
-              <w:t>Collections</w:t>
-            </w:r>
-          </w:p>
-        </w:tc>
-        <w:tc>
-          <w:tcPr>
-            <w:tcW w:type="dxa" w:w="2448"/>
-          </w:tcPr>
-          <w:p>
-            <w:r/>
-            <w:r>
-              <w:rPr>
-                <w:sz w:val="20"/>
-              </w:rPr>
-              <w:t>160</w:t>
-            </w:r>
-          </w:p>
-        </w:tc>
-        <w:tc>
-          <w:tcPr>
-            <w:tcW w:type="dxa" w:w="2448"/>
-          </w:tcPr>
-          <w:p>
-            <w:r/>
-            <w:r>
-              <w:rPr>
-                <w:sz w:val="20"/>
-              </w:rPr>
-              <w:t>14</w:t>
-            </w:r>
-          </w:p>
-        </w:tc>
-      </w:tr>
-      <w:tr>
-        <w:tc>
-          <w:tcPr>
-            <w:tcW w:type="dxa" w:w="3456"/>
-          </w:tcPr>
-          <w:p>
-            <w:r/>
-            <w:r>
-              <w:rPr>
-                <w:sz w:val="20"/>
-              </w:rPr>
-              <w:t>Full GCs</w:t>
-            </w:r>
-          </w:p>
-        </w:tc>
-        <w:tc>
-          <w:tcPr>
-            <w:tcW w:type="dxa" w:w="2448"/>
-          </w:tcPr>
-          <w:p>
-            <w:r/>
-            <w:r>
-              <w:rPr>
-                <w:sz w:val="20"/>
-              </w:rPr>
-              <w:t>2</w:t>
-            </w:r>
-          </w:p>
-        </w:tc>
-        <w:tc>
-          <w:tcPr>
-            <w:tcW w:type="dxa" w:w="2448"/>
-          </w:tcPr>
-          <w:p>
-            <w:r/>
-            <w:r>
-              <w:rPr>
-                <w:sz w:val="20"/>
-              </w:rPr>
-              <w:t>0</w:t>
-            </w:r>
-          </w:p>
-        </w:tc>
-      </w:tr>
-      <w:tr>
-        <w:tc>
-          <w:tcPr>
-            <w:tcW w:type="dxa" w:w="3456"/>
-          </w:tcPr>
-          <w:p>
-            <w:r/>
-            <w:r>
-              <w:rPr>
-                <w:sz w:val="20"/>
-              </w:rPr>
-              <w:t>Total stop-the-world pause</w:t>
-            </w:r>
-          </w:p>
-        </w:tc>
-        <w:tc>
-          <w:tcPr>
-            <w:tcW w:type="dxa" w:w="2448"/>
-          </w:tcPr>
-          <w:p>
-            <w:r/>
-            <w:r>
-              <w:rPr>
-                <w:sz w:val="20"/>
-              </w:rPr>
-              <w:t>483 ms</w:t>
-            </w:r>
-          </w:p>
-        </w:tc>
-        <w:tc>
-          <w:tcPr>
-            <w:tcW w:type="dxa" w:w="2448"/>
-          </w:tcPr>
-          <w:p>
-            <w:r/>
-            <w:r>
-              <w:rPr>
-                <w:sz w:val="20"/>
-              </w:rPr>
-              <w:t>102 ms</w:t>
-            </w:r>
-          </w:p>
-        </w:tc>
-      </w:tr>
-    </w:tbl>
-    <w:p>
-      <w:pPr>
-        <w:spacing w:after="80"/>
-      </w:pPr>
-    </w:p>
-    <w:p>
-      <w:r>
-        <w:t>Throughput did not improve at all here. It actually came out 1 percent lower, which is small enough to just be noise between runs. GC work still dropped a lot, from 160 collections to 14, but the application was not waiting on garbage collection in the first place at this level of load, so fixing GC gave nothing back in speed. I only saw the 68 percent gain once the load was heavy enough to actually exhaust the small heap.</w:t>
+        <w:t>Earlier I had run a lighter test, 2,000 requests of 5,000 items with 8 threads, and it barely moved: 577 requests per second before against 571 after, and 13.8 ms average response time against 14.0 ms. Collections still dropped from 160 to 14, but the application was not waiting on garbage collection at that load in the first place, so tidying up GC bought nothing. The 68 percent gain only turned up once the load was heavy enough to actually run the small heap out of room.</w:t>
       </w:r>
     </w:p>
     <w:p>
@@ -2533,247 +1134,27 @@
         <w:pStyle w:val="Heading1"/>
       </w:pPr>
       <w:r>
-        <w:t>6. Lessons Learned</w:t>
-      </w:r>
-    </w:p>
-    <w:p>
-      <w:pPr>
-        <w:pStyle w:val="ListBullet"/>
-      </w:pPr>
-      <w:r>
-        <w:t>Tuning only helps when the thing you are tuning is the actual bottleneck. My light load test proved that. GC activity fell sharply and the response times did not budge, because garbage collection was not what was holding it back at that point.</w:t>
-      </w:r>
-    </w:p>
-    <w:p>
-      <w:pPr>
-        <w:pStyle w:val="ListBullet"/>
-      </w:pPr>
-      <w:r>
-        <w:t>Measure before changing anything. If I had jumped straight to changing flags I would have had no way of knowing whether it helped, or which flag was responsible.</w:t>
-      </w:r>
-    </w:p>
-    <w:p>
-      <w:pPr>
-        <w:pStyle w:val="ListBullet"/>
-      </w:pPr>
-      <w:r>
-        <w:t>Check what a percentage is actually a percentage of. The 7.2 percent GC activity in VisualVM looked harmless next to a log showing the application frozen 68 percent of the time. Both were correct, because one is a share of eight cores and the other is a share of elapsed time.</w:t>
-      </w:r>
-    </w:p>
-    <w:p>
-      <w:pPr>
-        <w:pStyle w:val="ListBullet"/>
-      </w:pPr>
-      <w:r>
-        <w:t>Graphs and logs answer different questions. VisualVM showed me where to look, since I could see the heap pinned at its limit and the thread count sitting flat. For numbers I could put in a table, the GC log was far better than reading values off a moving chart.</w:t>
-      </w:r>
-    </w:p>
-    <w:p>
-      <w:pPr>
-        <w:pStyle w:val="ListBullet"/>
-      </w:pPr>
-      <w:r>
-        <w:t>Full GC count is a more useful warning sign than heap usage. A heap sitting near its limit is not automatically a problem, that can just be the collector being efficient. Repeated full GCs are, because each one freezes the whole application.</w:t>
-      </w:r>
-    </w:p>
-    <w:p>
-      <w:pPr>
-        <w:pStyle w:val="ListBullet"/>
-      </w:pPr>
-      <w:r>
-        <w:t>Rising CPU can be a good sign. CPU went up from 34 to 39 percent after tuning, which looks like a regression until you notice throughput went up 68 percent at the same time. The CPU was finally being spent on requests instead of on garbage collection.</w:t>
-      </w:r>
-    </w:p>
-    <w:p>
-      <w:pPr>
-        <w:pStyle w:val="ListBullet"/>
-      </w:pPr>
-      <w:r>
-        <w:t>A bigger heap is not automatically better. I went to 512 MB because that was the size that removed the full GCs. Setting it enormously high would have wasted memory the service does not need, and very large heaps can make individual collections take longer.</w:t>
-      </w:r>
-    </w:p>
-    <w:p>
-      <w:pPr>
-        <w:pStyle w:val="ListBullet"/>
-      </w:pPr>
-      <w:r>
-        <w:t>The default settings on my machine would have hidden all of this. Java chose a 7.9 GB maximum heap and G1 on its own, and the endpoint never struggled. I had to deliberately restrict the heap to 128 MB to create a problem worth investigating, which is roughly the situation you would be in deploying to a small container with a memory limit.</w:t>
-      </w:r>
-    </w:p>
-    <w:p>
-      <w:pPr>
-        <w:pStyle w:val="Heading1"/>
-      </w:pPr>
-      <w:r>
-        <w:t>7. Conclusion</w:t>
+        <w:t>What I learned</w:t>
       </w:r>
     </w:p>
     <w:p>
       <w:r>
-        <w:t>I built a Spring Boot microservice with one REST endpoint, monitored it in VisualVM while it was under load, found that a 128 MB heap with the serial collector was leaving the application frozen for most of the test, and fixed it by raising the heap to 512 MB and switching to G1 with a 100 ms pause target. That took throughput from 103 to 173.5 requests per second and removed all 76 full GCs. The parts I will remember are that the same change made no difference under lighter load, and that the most alarming-looking number on the VisualVM dashboard was not the one that mattered.</w:t>
-      </w:r>
-    </w:p>
-    <w:p>
-      <w:pPr>
-        <w:pStyle w:val="Heading1"/>
-      </w:pPr>
-      <w:r>
-        <w:t>Appendix: Reproducing the Tests</w:t>
+        <w:t>Tuning only helps if the thing you are tuning is what is actually slowing you down. The light load test made that obvious, since GC work dropped a long way and the response times did not move at all.</w:t>
       </w:r>
     </w:p>
     <w:p>
       <w:r>
-        <w:t>Baseline run:</w:t>
-      </w:r>
-    </w:p>
-    <w:p>
-      <w:pPr>
-        <w:spacing w:after="0" w:before="0"/>
-        <w:ind w:left="360"/>
-        <w:shd w:val="clear" w:fill="F2F2F2"/>
-      </w:pPr>
-      <w:r>
-        <w:rPr>
-          <w:rFonts w:ascii="Consolas" w:hAnsi="Consolas"/>
-          <w:sz w:val="19"/>
-        </w:rPr>
-        <w:t>java -Xms64m -Xmx128m -XX:+UseSerialGC \</w:t>
-      </w:r>
-    </w:p>
-    <w:p>
-      <w:pPr>
-        <w:spacing w:after="0" w:before="0"/>
-        <w:ind w:left="360"/>
-        <w:shd w:val="clear" w:fill="F2F2F2"/>
-      </w:pPr>
-      <w:r>
-        <w:rPr>
-          <w:rFonts w:ascii="Consolas" w:hAnsi="Consolas"/>
-          <w:sz w:val="19"/>
-        </w:rPr>
-        <w:t xml:space="preserve">     -Xlog:gc:file=baseline-gc.log:time,level,tags \</w:t>
-      </w:r>
-    </w:p>
-    <w:p>
-      <w:pPr>
-        <w:spacing w:after="200" w:before="0"/>
-        <w:ind w:left="360"/>
-        <w:shd w:val="clear" w:fill="F2F2F2"/>
-      </w:pPr>
-      <w:r>
-        <w:rPr>
-          <w:rFonts w:ascii="Consolas" w:hAnsi="Consolas"/>
-          <w:sz w:val="19"/>
-        </w:rPr>
-        <w:t xml:space="preserve">     -jar target/itemservice-0.0.1-SNAPSHOT.jar</w:t>
+        <w:t>It is worth checking what a percentage is a percentage of. The 7.2 percent GC activity looked fine sitting next to a log that showed the application frozen 68 percent of the time, and neither number was wrong.</w:t>
       </w:r>
     </w:p>
     <w:p>
       <w:r>
-        <w:t>Tuned run:</w:t>
-      </w:r>
-    </w:p>
-    <w:p>
-      <w:pPr>
-        <w:spacing w:after="0" w:before="0"/>
-        <w:ind w:left="360"/>
-        <w:shd w:val="clear" w:fill="F2F2F2"/>
-      </w:pPr>
-      <w:r>
-        <w:rPr>
-          <w:rFonts w:ascii="Consolas" w:hAnsi="Consolas"/>
-          <w:sz w:val="19"/>
-        </w:rPr>
-        <w:t>java -Xms512m -Xmx512m -XX:+UseG1GC -XX:MaxGCPauseMillis=100 \</w:t>
-      </w:r>
-    </w:p>
-    <w:p>
-      <w:pPr>
-        <w:spacing w:after="0" w:before="0"/>
-        <w:ind w:left="360"/>
-        <w:shd w:val="clear" w:fill="F2F2F2"/>
-      </w:pPr>
-      <w:r>
-        <w:rPr>
-          <w:rFonts w:ascii="Consolas" w:hAnsi="Consolas"/>
-          <w:sz w:val="19"/>
-        </w:rPr>
-        <w:t xml:space="preserve">     -Xlog:gc:file=tuned-gc.log:time,level,tags \</w:t>
-      </w:r>
-    </w:p>
-    <w:p>
-      <w:pPr>
-        <w:spacing w:after="200" w:before="0"/>
-        <w:ind w:left="360"/>
-        <w:shd w:val="clear" w:fill="F2F2F2"/>
-      </w:pPr>
-      <w:r>
-        <w:rPr>
-          <w:rFonts w:ascii="Consolas" w:hAnsi="Consolas"/>
-          <w:sz w:val="19"/>
-        </w:rPr>
-        <w:t xml:space="preserve">     -jar target/itemservice-0.0.1-SNAPSHOT.jar</w:t>
+        <w:t>Repeated full GCs are a better warning sign than a heap sitting near its limit. A full heap can just mean the collector is doing its job well. Full GCs freeze everything, every time.</w:t>
       </w:r>
     </w:p>
     <w:p>
       <w:r>
-        <w:t>Load came from loadtest.py (1,200 requests, 16 concurrent, count=25000). Counting the collections and the stop-the-world pauses afterwards, note that matching on "Pause" is what keeps G1's concurrent phases out of the total:</w:t>
-      </w:r>
-    </w:p>
-    <w:p>
-      <w:pPr>
-        <w:spacing w:after="0" w:before="0"/>
-        <w:ind w:left="360"/>
-        <w:shd w:val="clear" w:fill="F2F2F2"/>
-      </w:pPr>
-      <w:r>
-        <w:rPr>
-          <w:rFonts w:ascii="Consolas" w:hAnsi="Consolas"/>
-          <w:sz w:val="19"/>
-        </w:rPr>
-        <w:t>grep -c 'Pause Young\|Pause Full' baseline-gc.log</w:t>
-      </w:r>
-    </w:p>
-    <w:p>
-      <w:pPr>
-        <w:spacing w:after="0" w:before="0"/>
-        <w:ind w:left="360"/>
-        <w:shd w:val="clear" w:fill="F2F2F2"/>
-      </w:pPr>
-      <w:r>
-        <w:rPr>
-          <w:rFonts w:ascii="Consolas" w:hAnsi="Consolas"/>
-          <w:sz w:val="19"/>
-        </w:rPr>
-        <w:t>grep -c 'Pause Full' baseline-gc.log</w:t>
-      </w:r>
-    </w:p>
-    <w:p>
-      <w:pPr>
-        <w:spacing w:after="0" w:before="0"/>
-        <w:ind w:left="360"/>
-        <w:shd w:val="clear" w:fill="F2F2F2"/>
-      </w:pPr>
-      <w:r>
-        <w:rPr>
-          <w:rFonts w:ascii="Consolas" w:hAnsi="Consolas"/>
-          <w:sz w:val="19"/>
-        </w:rPr>
-        <w:t>grep -oP 'Pause (Young|Full).*?\K\d+\.\d+(?=ms)' baseline-gc.log \</w:t>
-      </w:r>
-    </w:p>
-    <w:p>
-      <w:pPr>
-        <w:spacing w:after="200" w:before="0"/>
-        <w:ind w:left="360"/>
-        <w:shd w:val="clear" w:fill="F2F2F2"/>
-      </w:pPr>
-      <w:r>
-        <w:rPr>
-          <w:rFonts w:ascii="Consolas" w:hAnsi="Consolas"/>
-          <w:sz w:val="19"/>
-        </w:rPr>
-        <w:t xml:space="preserve">    | awk '{s+=$1} END {print s " ms"}'</w:t>
+        <w:t>Bigger is not automatically better either. I went with 512 MB because that was what got rid of the full GCs, and going much higher would waste memory and can make individual collections take longer. Java's own default on this machine was a 7.9 GB heap with G1 already chosen, and the endpoint never struggled, so I had to shrink the heap on purpose to create a problem worth looking at. That is roughly the situation you would be in deploying into a container with a small memory limit.</w:t>
       </w:r>
     </w:p>
     <w:sectPr>
@@ -3150,7 +1531,7 @@
     <w:qFormat/>
     <w:rsid w:val="00FC693F"/>
     <w:pPr>
-      <w:spacing w:after="160" w:line="276" w:lineRule="auto"/>
+      <w:spacing w:after="160" w:line="264" w:lineRule="auto"/>
     </w:pPr>
     <w:rPr>
       <w:rFonts w:ascii="Calibri" w:hAnsi="Calibri"/>

</xml_diff>

<commit_message>
Add Day 2 Assignment header, set course, and cut the numbers back
Adds the Day 2 Assignment line above the title and fills in Techstart
as the course.

Thins out the statistics so the writing carries the story instead of
the figures: the results table drops to five rows with rounded values,
and the exact collection counts, pause totals and percentages are
replaced with plain description in the monitoring, tuning and results
sections. Word count is down from 1,309 to about 1,050.

Also fixes the results table stretching across the full page. The
column widths in w:tblGrid were still equal thirds, which is what
LibreOffice honours regardless of the per-cell widths.
</commit_message>
<xml_diff>
--- a/JVM-Tuning-Assignment.docx
+++ b/JVM-Tuning-Assignment.docx
@@ -4,6 +4,20 @@
   <w:body>
     <w:p>
       <w:pPr>
+        <w:spacing w:after="40"/>
+        <w:jc w:val="center"/>
+      </w:pPr>
+      <w:r>
+        <w:rPr>
+          <w:b/>
+          <w:sz w:val="24"/>
+        </w:rPr>
+        <w:t>Day 2 Assignment</w:t>
+      </w:r>
+    </w:p>
+    <w:p>
+      <w:pPr>
+        <w:spacing w:after="120"/>
         <w:jc w:val="center"/>
       </w:pPr>
       <w:r>
@@ -30,7 +44,7 @@
         <w:rPr>
           <w:sz w:val="21"/>
         </w:rPr>
-        <w:t>[Course / Section]</w:t>
+        <w:t>Techstart</w:t>
         <w:br/>
       </w:r>
       <w:r>
@@ -55,7 +69,7 @@
     </w:p>
     <w:p>
       <w:r>
-        <w:t>Spring Boot runs on the JVM, and the JVM is what decides how much memory the application gets and when it clears out objects that are no longer needed. That clearing out is garbage collection. If the heap is too small the collector keeps running, and the application spends more time freeing memory than answering requests. Tuning means setting options like the heap size and the collector type to fit the work the application actually does. I built a small item service, put it under load, watched it in VisualVM, then changed the settings and measured what happened. Everything here ran on Java 21 with Spring Boot 3.4.1, on a machine with 8 cores and 31 GB of RAM.</w:t>
+        <w:t>Spring Boot runs on the JVM, and the JVM decides how much memory the application gets and when it clears out objects that are no longer needed. That clearing out is garbage collection. If the heap is too small the collector keeps running, and the application spends more time freeing memory than answering requests. Tuning means setting options like the heap size and the collector type to fit the work the application actually does. I built a small item service, put it under load, watched it in VisualVM, then changed the settings to see what would happen. Everything here ran on Java 21 with Spring Boot 3.4.1, on a machine with eight cores.</w:t>
       </w:r>
     </w:p>
     <w:p>
@@ -330,7 +344,7 @@
     </w:p>
     <w:p>
       <w:r>
-        <w:t>The list gets rebuilt on every request instead of being cached, which is on purpose. A cached list would barely allocate anything and there would be nothing to watch in VisualVM. Rebuilding it means every request throws away thousands of objects.</w:t>
+        <w:t>The list gets rebuilt on every request instead of being cached, which is on purpose. A cached list would barely allocate anything and there would be nothing to watch in VisualVM.</w:t>
       </w:r>
     </w:p>
     <w:p>
@@ -397,7 +411,7 @@
     </w:p>
     <w:p>
       <w:r>
-        <w:t>I got VisualVM from visualvm.github.io and started it while the service was already running. The process shows up on the left under Local, and double clicking it opens the Overview tab, which is handy because it shows the JVM options the process actually started with. I ran the first round with a small heap and the serial collector so there would be something to find:</w:t>
+        <w:t>I got VisualVM from visualvm.github.io and started it while the service was already running. The process shows up on the left under Local, and double clicking it opens the Overview tab, which shows the JVM options the process started with. I ran the first round with a small heap and the serial collector so there would be something to find:</w:t>
       </w:r>
     </w:p>
     <w:p>
@@ -498,7 +512,7 @@
     </w:p>
     <w:p>
       <w:r>
-        <w:t>Nothing much happens while the application is idle, so I wrote a Python script that hits the endpoint with 16 threads asking for 25,000 items each, and left it looping for about two and a half minutes while I watched the Monitor tab.</w:t>
+        <w:t>Nothing much happens while the application is idle, so I wrote a Python script that hits the endpoint from several threads at once and left it looping for a couple of minutes while I watched the Monitor tab.</w:t>
       </w:r>
     </w:p>
     <w:p>
@@ -557,12 +571,12 @@
     </w:p>
     <w:p>
       <w:r>
-        <w:t>Heap went straight to the 128 MB ceiling and stayed pinned there. Used heap sawtoothed between roughly 25 and 100 MB and never settled, so the collector was running constantly rather than every now and then. CPU sat around 34 percent, and threads went from 29 to 37 when the load arrived and then stayed flat, so the thread count was not the problem.</w:t>
+        <w:t>Heap went straight up to its ceiling and stayed pinned there, and used heap sawtoothed up and down without ever settling, so the collector was running constantly rather than every now and then. Threads went up when the load arrived and then stayed flat, so the thread count was not the problem.</w:t>
       </w:r>
     </w:p>
     <w:p>
       <w:r>
-        <w:t>The GC activity figure confused me at first. VisualVM showed 7.2 percent, which sounds harmless, but the GC log for the same session recorded 3,137 collections, 695 of them full GCs, and 95.5 seconds of pauses. During the busiest ten seconds the application was frozen 68 percent of the time. Both numbers are right. Serial GC stops everything and then works on a single thread, and VisualVM reports GC time spread across all 8 cores, so one fully busy core comes out at around 7 percent. The graph answers how much of the CPU is going into GC, and the log answers how long the application is frozen. For a service that has to answer requests, the second one is what matters.</w:t>
+        <w:t>The GC activity figure confused me at first. VisualVM showed about 7 percent, which sounds harmless, but the GC log for the same session was full of collections and showed the application frozen for most of the run. Both are right. Serial GC stops everything and then works on a single thread, and VisualVM spreads GC time across all the cores, so one busy core out of eight looks small. The graph shows how much of the CPU is going into GC, while the log shows how long the application is actually stopped, and for a service answering requests it is the second one that matters.</w:t>
       </w:r>
     </w:p>
     <w:p>
@@ -730,7 +744,7 @@
     </w:p>
     <w:p>
       <w:r>
-        <w:t>Used heap now moves between about 100 and 400 MB with visible gaps instead of one solid band, so the collector gets to rest between cycles. GC activity dropped from 7.2 percent to 0.1, full GCs went from 695 to none, and the total pause time fell from 95.5 seconds to 2.3. CPU actually went up a little, from 34 to 39 percent, which looked wrong until I realised the CPU was finally being spent on requests instead of on collecting garbage.</w:t>
+        <w:t>Used heap now moves up and down with visible gaps instead of one solid band, so the collector gets to rest between cycles. GC activity dropped to almost nothing and the full collections disappeared completely. CPU actually went up a little, which looked wrong until I realised it was finally being spent on requests instead of on collecting garbage.</w:t>
       </w:r>
     </w:p>
     <w:p>
@@ -743,7 +757,7 @@
     </w:p>
     <w:p>
       <w:r>
-        <w:t>Screenshots show behaviour but not speed, so I ran the load test again with VisualVM detached: 1,200 requests, 16 at a time, 25,000 items each. Same code and same machine, only the flags were different.</w:t>
+        <w:t>Screenshots show behaviour but not speed, so I ran the load test again with VisualVM detached. Same code and same machine, only the flags were different.</w:t>
       </w:r>
     </w:p>
     <w:tbl>
@@ -751,17 +765,18 @@
         <w:tblStyle w:val="TableGrid"/>
         <w:tblW w:type="auto" w:w="0"/>
         <w:jc w:val="center"/>
+        <w:tblLayout w:type="fixed"/>
         <w:tblLook w:firstColumn="1" w:firstRow="1" w:lastColumn="0" w:lastRow="0" w:noHBand="0" w:noVBand="1" w:val="04A0"/>
       </w:tblPr>
       <w:tblGrid>
-        <w:gridCol w:w="3120"/>
-        <w:gridCol w:w="3120"/>
-        <w:gridCol w:w="3120"/>
+        <w:gridCol w:w="3600"/>
+        <w:gridCol w:w="1440"/>
+        <w:gridCol w:w="1440"/>
       </w:tblGrid>
       <w:tr>
         <w:tc>
           <w:tcPr>
-            <w:tcW w:type="dxa" w:w="3888"/>
+            <w:tcW w:type="dxa" w:w="3600"/>
           </w:tcPr>
           <w:p>
             <w:r/>
@@ -775,7 +790,7 @@
         </w:tc>
         <w:tc>
           <w:tcPr>
-            <w:tcW w:type="dxa" w:w="2304"/>
+            <w:tcW w:type="dxa" w:w="1440"/>
           </w:tcPr>
           <w:p>
             <w:r/>
@@ -790,7 +805,7 @@
         </w:tc>
         <w:tc>
           <w:tcPr>
-            <w:tcW w:type="dxa" w:w="2304"/>
+            <w:tcW w:type="dxa" w:w="1440"/>
           </w:tcPr>
           <w:p>
             <w:r/>
@@ -807,7 +822,7 @@
       <w:tr>
         <w:tc>
           <w:tcPr>
-            <w:tcW w:type="dxa" w:w="3888"/>
+            <w:tcW w:type="dxa" w:w="3600"/>
           </w:tcPr>
           <w:p>
             <w:r/>
@@ -821,7 +836,7 @@
         </w:tc>
         <w:tc>
           <w:tcPr>
-            <w:tcW w:type="dxa" w:w="2304"/>
+            <w:tcW w:type="dxa" w:w="1440"/>
           </w:tcPr>
           <w:p>
             <w:r/>
@@ -829,13 +844,13 @@
               <w:rPr>
                 <w:sz w:val="20"/>
               </w:rPr>
-              <w:t>103.0</w:t>
+              <w:t>103</w:t>
             </w:r>
           </w:p>
         </w:tc>
         <w:tc>
           <w:tcPr>
-            <w:tcW w:type="dxa" w:w="2304"/>
+            <w:tcW w:type="dxa" w:w="1440"/>
           </w:tcPr>
           <w:p>
             <w:r/>
@@ -843,7 +858,7 @@
               <w:rPr>
                 <w:sz w:val="20"/>
               </w:rPr>
-              <w:t>173.5</w:t>
+              <w:t>174</w:t>
             </w:r>
           </w:p>
         </w:tc>
@@ -851,7 +866,7 @@
       <w:tr>
         <w:tc>
           <w:tcPr>
-            <w:tcW w:type="dxa" w:w="3888"/>
+            <w:tcW w:type="dxa" w:w="3600"/>
           </w:tcPr>
           <w:p>
             <w:r/>
@@ -865,7 +880,7 @@
         </w:tc>
         <w:tc>
           <w:tcPr>
-            <w:tcW w:type="dxa" w:w="2304"/>
+            <w:tcW w:type="dxa" w:w="1440"/>
           </w:tcPr>
           <w:p>
             <w:r/>
@@ -873,13 +888,13 @@
               <w:rPr>
                 <w:sz w:val="20"/>
               </w:rPr>
-              <w:t>155.0 ms</w:t>
+              <w:t>155 ms</w:t>
             </w:r>
           </w:p>
         </w:tc>
         <w:tc>
           <w:tcPr>
-            <w:tcW w:type="dxa" w:w="2304"/>
+            <w:tcW w:type="dxa" w:w="1440"/>
           </w:tcPr>
           <w:p>
             <w:r/>
@@ -887,7 +902,7 @@
               <w:rPr>
                 <w:sz w:val="20"/>
               </w:rPr>
-              <w:t>92.0 ms</w:t>
+              <w:t>92 ms</w:t>
             </w:r>
           </w:p>
         </w:tc>
@@ -895,7 +910,7 @@
       <w:tr>
         <w:tc>
           <w:tcPr>
-            <w:tcW w:type="dxa" w:w="3888"/>
+            <w:tcW w:type="dxa" w:w="3600"/>
           </w:tcPr>
           <w:p>
             <w:r/>
@@ -903,13 +918,13 @@
               <w:rPr>
                 <w:sz w:val="20"/>
               </w:rPr>
-              <w:t>95th percentile response time</w:t>
+              <w:t>Slowest 5% of requests</w:t>
             </w:r>
           </w:p>
         </w:tc>
         <w:tc>
           <w:tcPr>
-            <w:tcW w:type="dxa" w:w="2304"/>
+            <w:tcW w:type="dxa" w:w="1440"/>
           </w:tcPr>
           <w:p>
             <w:r/>
@@ -917,13 +932,13 @@
               <w:rPr>
                 <w:sz w:val="20"/>
               </w:rPr>
-              <w:t>287.7 ms</w:t>
+              <w:t>288 ms</w:t>
             </w:r>
           </w:p>
         </w:tc>
         <w:tc>
           <w:tcPr>
-            <w:tcW w:type="dxa" w:w="2304"/>
+            <w:tcW w:type="dxa" w:w="1440"/>
           </w:tcPr>
           <w:p>
             <w:r/>
@@ -931,7 +946,7 @@
               <w:rPr>
                 <w:sz w:val="20"/>
               </w:rPr>
-              <w:t>115.3 ms</w:t>
+              <w:t>115 ms</w:t>
             </w:r>
           </w:p>
         </w:tc>
@@ -939,7 +954,7 @@
       <w:tr>
         <w:tc>
           <w:tcPr>
-            <w:tcW w:type="dxa" w:w="3888"/>
+            <w:tcW w:type="dxa" w:w="3600"/>
           </w:tcPr>
           <w:p>
             <w:r/>
@@ -947,101 +962,13 @@
               <w:rPr>
                 <w:sz w:val="20"/>
               </w:rPr>
-              <w:t>Time to finish 1,200 requests</w:t>
+              <w:t>Full collections</w:t>
             </w:r>
           </w:p>
         </w:tc>
         <w:tc>
           <w:tcPr>
-            <w:tcW w:type="dxa" w:w="2304"/>
-          </w:tcPr>
-          <w:p>
-            <w:r/>
-            <w:r>
-              <w:rPr>
-                <w:sz w:val="20"/>
-              </w:rPr>
-              <w:t>11.65 s</w:t>
-            </w:r>
-          </w:p>
-        </w:tc>
-        <w:tc>
-          <w:tcPr>
-            <w:tcW w:type="dxa" w:w="2304"/>
-          </w:tcPr>
-          <w:p>
-            <w:r/>
-            <w:r>
-              <w:rPr>
-                <w:sz w:val="20"/>
-              </w:rPr>
-              <w:t>6.92 s</w:t>
-            </w:r>
-          </w:p>
-        </w:tc>
-      </w:tr>
-      <w:tr>
-        <w:tc>
-          <w:tcPr>
-            <w:tcW w:type="dxa" w:w="3888"/>
-          </w:tcPr>
-          <w:p>
-            <w:r/>
-            <w:r>
-              <w:rPr>
-                <w:sz w:val="20"/>
-              </w:rPr>
-              <w:t>Collections</w:t>
-            </w:r>
-          </w:p>
-        </w:tc>
-        <w:tc>
-          <w:tcPr>
-            <w:tcW w:type="dxa" w:w="2304"/>
-          </w:tcPr>
-          <w:p>
-            <w:r/>
-            <w:r>
-              <w:rPr>
-                <w:sz w:val="20"/>
-              </w:rPr>
-              <w:t>369</w:t>
-            </w:r>
-          </w:p>
-        </w:tc>
-        <w:tc>
-          <w:tcPr>
-            <w:tcW w:type="dxa" w:w="2304"/>
-          </w:tcPr>
-          <w:p>
-            <w:r/>
-            <w:r>
-              <w:rPr>
-                <w:sz w:val="20"/>
-              </w:rPr>
-              <w:t>32</w:t>
-            </w:r>
-          </w:p>
-        </w:tc>
-      </w:tr>
-      <w:tr>
-        <w:tc>
-          <w:tcPr>
-            <w:tcW w:type="dxa" w:w="3888"/>
-          </w:tcPr>
-          <w:p>
-            <w:r/>
-            <w:r>
-              <w:rPr>
-                <w:sz w:val="20"/>
-              </w:rPr>
-              <w:t>Full GCs</w:t>
-            </w:r>
-          </w:p>
-        </w:tc>
-        <w:tc>
-          <w:tcPr>
-            <w:tcW w:type="dxa" w:w="2304"/>
+            <w:tcW w:type="dxa" w:w="1440"/>
           </w:tcPr>
           <w:p>
             <w:r/>
@@ -1055,7 +982,7 @@
         </w:tc>
         <w:tc>
           <w:tcPr>
-            <w:tcW w:type="dxa" w:w="2304"/>
+            <w:tcW w:type="dxa" w:w="1440"/>
           </w:tcPr>
           <w:p>
             <w:r/>
@@ -1071,7 +998,7 @@
       <w:tr>
         <w:tc>
           <w:tcPr>
-            <w:tcW w:type="dxa" w:w="3888"/>
+            <w:tcW w:type="dxa" w:w="3600"/>
           </w:tcPr>
           <w:p>
             <w:r/>
@@ -1079,13 +1006,13 @@
               <w:rPr>
                 <w:sz w:val="20"/>
               </w:rPr>
-              <w:t>Total pause time</w:t>
+              <w:t>Total time paused</w:t>
             </w:r>
           </w:p>
         </w:tc>
         <w:tc>
           <w:tcPr>
-            <w:tcW w:type="dxa" w:w="2304"/>
+            <w:tcW w:type="dxa" w:w="1440"/>
           </w:tcPr>
           <w:p>
             <w:r/>
@@ -1093,13 +1020,13 @@
               <w:rPr>
                 <w:sz w:val="20"/>
               </w:rPr>
-              <w:t>9,812 ms</w:t>
+              <w:t>9.8 s</w:t>
             </w:r>
           </w:p>
         </w:tc>
         <w:tc>
           <w:tcPr>
-            <w:tcW w:type="dxa" w:w="2304"/>
+            <w:tcW w:type="dxa" w:w="1440"/>
           </w:tcPr>
           <w:p>
             <w:r/>
@@ -1107,7 +1034,7 @@
               <w:rPr>
                 <w:sz w:val="20"/>
               </w:rPr>
-              <w:t>191 ms</w:t>
+              <w:t>0.2 s</w:t>
             </w:r>
           </w:p>
         </w:tc>
@@ -1116,17 +1043,12 @@
     <w:p/>
     <w:p>
       <w:r>
-        <w:t>76 full GCs before and none after is the number that stands out. Each one freezes every thread, and that is what made the slowest requests slow, which is why the 95th percentile came down from 287.7 ms to 115.3 ms.</w:t>
+        <w:t>The full collections are what stand out. Each one freezes every thread while it works, and that is what made the slowest requests slow.</w:t>
       </w:r>
     </w:p>
     <w:p>
       <w:r>
-        <w:t>Two things I had to be careful about when reading the log. The pause total covers the 18.9 seconds the log spans rather than just the 11.65 seconds of measured requests, so it works out to 52 percent of that window and not the much higher figure I got the first time. And G1 logs its concurrent phases alongside its pauses, and concurrent work does not stop the application, so counting those would have made the tuned total look about 45 ms worse than it really is.</w:t>
-      </w:r>
-    </w:p>
-    <w:p>
-      <w:r>
-        <w:t>Earlier I had run a lighter test, 2,000 requests of 5,000 items with 8 threads, and it barely moved: 577 requests per second before against 571 after, and 13.8 ms average response time against 14.0 ms. Collections still dropped from 160 to 14, but the application was not waiting on garbage collection at that load in the first place, so tidying up GC bought nothing. The 68 percent gain only turned up once the load was heavy enough to actually run the small heap out of room.</w:t>
+        <w:t>I had run a lighter test earlier and it barely moved at all. The GC work still dropped, but the application was not waiting on garbage collection at that load in the first place, so there was nothing for the change to fix. The improvement only turned up once the load was heavy enough to run the small heap out of room.</w:t>
       </w:r>
     </w:p>
     <w:p>
@@ -1139,22 +1061,17 @@
     </w:p>
     <w:p>
       <w:r>
-        <w:t>Tuning only helps if the thing you are tuning is what is actually slowing you down. The light load test made that obvious, since GC work dropped a long way and the response times did not move at all.</w:t>
+        <w:t>Tuning only helps if the thing you are tuning is what is actually slowing you down. The lighter test made that obvious, since the GC work dropped a long way and the response times did not move at all.</w:t>
       </w:r>
     </w:p>
     <w:p>
       <w:r>
-        <w:t>It is worth checking what a percentage is a percentage of. The 7.2 percent GC activity looked fine sitting next to a log that showed the application frozen 68 percent of the time, and neither number was wrong.</w:t>
+        <w:t>It is also worth checking what a percentage is a percentage of. The GC activity on screen looked fine sitting next to a log that showed the application frozen for most of the run, and neither number was wrong.</w:t>
       </w:r>
     </w:p>
     <w:p>
       <w:r>
-        <w:t>Repeated full GCs are a better warning sign than a heap sitting near its limit. A full heap can just mean the collector is doing its job well. Full GCs freeze everything, every time.</w:t>
-      </w:r>
-    </w:p>
-    <w:p>
-      <w:r>
-        <w:t>Bigger is not automatically better either. I went with 512 MB because that was what got rid of the full GCs, and going much higher would waste memory and can make individual collections take longer. Java's own default on this machine was a 7.9 GB heap with G1 already chosen, and the endpoint never struggled, so I had to shrink the heap on purpose to create a problem worth looking at. That is roughly the situation you would be in deploying into a container with a small memory limit.</w:t>
+        <w:t>Repeated full collections turned out to be a better warning sign than a heap sitting near its limit, since a full heap can just mean the collector is doing its job well. And bigger is not automatically better. I went with 512 MB because that was what got rid of them. Java's own default on this machine was a much larger heap with G1 already chosen, and the endpoint never struggled, so I had to shrink it on purpose to create a problem worth looking at.</w:t>
       </w:r>
     </w:p>
     <w:sectPr>

</xml_diff>